<commit_message>
Update curriculum vitae and resume to enhance clarity and relevance of skills and experience
</commit_message>
<xml_diff>
--- a/it/curriculum_gianluigi_liguori.docx
+++ b/it/curriculum_gianluigi_liguori.docx
@@ -312,7 +312,7 @@
     <w:tbl>
       <w:tblPr>
         <w:tblStyle w:val="TableGrid"/>
-        <w:tblW w:w="9880" w:type="dxa"/>
+        <w:tblW w:w="8049" w:type="dxa"/>
         <w:tblBorders>
           <w:top w:val="none" w:sz="0" w:space="0" w:color="auto"/>
           <w:left w:val="none" w:sz="0" w:space="0" w:color="auto"/>
@@ -325,8 +325,6 @@
         <w:tblLook w:val="04A0" w:firstRow="1" w:lastRow="0" w:firstColumn="1" w:lastColumn="0" w:noHBand="0" w:noVBand="1"/>
       </w:tblPr>
       <w:tblGrid>
-        <w:gridCol w:w="300"/>
-        <w:gridCol w:w="1531"/>
         <w:gridCol w:w="300"/>
         <w:gridCol w:w="2438"/>
         <w:gridCol w:w="297"/>
@@ -344,110 +342,6 @@
               <w:left w:w="0" w:type="dxa"/>
               <w:right w:w="0" w:type="dxa"/>
             </w:tcMar>
-          </w:tcPr>
-          <w:p>
-            <w:pPr>
-              <w:spacing w:before="30"/>
-              <w:ind w:right="-20"/>
-              <w:jc w:val="right"/>
-              <w:rPr>
-                <w:rFonts w:ascii="Georgia" w:eastAsia="Georgia" w:hAnsi="Georgia" w:cs="Georgia"/>
-                <w:color w:val="FFFFFF" w:themeColor="background1"/>
-              </w:rPr>
-            </w:pPr>
-            <w:bookmarkStart w:id="1" w:name="_Hlk89602339"/>
-            <w:r>
-              <w:rPr>
-                <w:noProof/>
-                <w:color w:val="FFFFFF" w:themeColor="background1"/>
-              </w:rPr>
-              <w:drawing>
-                <wp:inline distT="0" distB="0" distL="0" distR="0" wp14:anchorId="448134B6" wp14:editId="2BCFF51F">
-                  <wp:extent cx="168902" cy="168902"/>
-                  <wp:effectExtent l="0" t="0" r="3175" b="3175"/>
-                  <wp:docPr id="9" name="Graphic 9" descr="Receiver with solid fill"/>
-                  <wp:cNvGraphicFramePr>
-                    <a:graphicFrameLocks xmlns:a="http://schemas.openxmlformats.org/drawingml/2006/main" noChangeAspect="1"/>
-                  </wp:cNvGraphicFramePr>
-                  <a:graphic xmlns:a="http://schemas.openxmlformats.org/drawingml/2006/main">
-                    <a:graphicData uri="http://schemas.openxmlformats.org/drawingml/2006/picture">
-                      <pic:pic xmlns:pic="http://schemas.openxmlformats.org/drawingml/2006/picture">
-                        <pic:nvPicPr>
-                          <pic:cNvPr id="9" name="Graphic 9" descr="Receiver with solid fill"/>
-                          <pic:cNvPicPr/>
-                        </pic:nvPicPr>
-                        <pic:blipFill>
-                          <a:blip r:embed="rId9" cstate="print">
-                            <a:extLst>
-                              <a:ext uri="{28A0092B-C50C-407E-A947-70E740481C1C}">
-                                <a14:useLocalDpi xmlns:a14="http://schemas.microsoft.com/office/drawing/2010/main" val="0"/>
-                              </a:ext>
-                              <a:ext uri="{96DAC541-7B7A-43D3-8B79-37D633B846F1}">
-                                <asvg:svgBlip xmlns:asvg="http://schemas.microsoft.com/office/drawing/2016/SVG/main" r:embed="rId10"/>
-                              </a:ext>
-                            </a:extLst>
-                          </a:blip>
-                          <a:stretch>
-                            <a:fillRect/>
-                          </a:stretch>
-                        </pic:blipFill>
-                        <pic:spPr>
-                          <a:xfrm>
-                            <a:off x="0" y="0"/>
-                            <a:ext cx="191694" cy="191694"/>
-                          </a:xfrm>
-                          <a:prstGeom prst="rect">
-                            <a:avLst/>
-                          </a:prstGeom>
-                        </pic:spPr>
-                      </pic:pic>
-                    </a:graphicData>
-                  </a:graphic>
-                </wp:inline>
-              </w:drawing>
-            </w:r>
-            <w:r>
-              <w:rPr>
-                <w:rFonts w:ascii="Georgia" w:eastAsia="Georgia" w:hAnsi="Georgia" w:cs="Georgia"/>
-                <w:color w:val="FFFFFF" w:themeColor="background1"/>
-              </w:rPr>
-              <w:t xml:space="preserve"> </w:t>
-            </w:r>
-          </w:p>
-        </w:tc>
-        <w:tc>
-          <w:tcPr>
-            <w:tcW w:w="1531" w:type="dxa"/>
-            <w:tcMar>
-              <w:left w:w="0" w:type="dxa"/>
-              <w:right w:w="0" w:type="dxa"/>
-            </w:tcMar>
-          </w:tcPr>
-          <w:p>
-            <w:pPr>
-              <w:spacing w:before="30"/>
-              <w:ind w:right="-20"/>
-              <w:rPr>
-                <w:rFonts w:ascii="Georgia" w:eastAsia="Georgia" w:hAnsi="Georgia" w:cs="Georgia"/>
-                <w:color w:val="FFFFFF"/>
-              </w:rPr>
-            </w:pPr>
-            <w:r>
-              <w:rPr>
-                <w:rFonts w:ascii="Georgia" w:eastAsia="Georgia" w:hAnsi="Georgia" w:cs="Georgia"/>
-                <w:color w:val="FFFFFF"/>
-              </w:rPr>
-              <w:t xml:space="preserve"> 389 6403200</w:t>
-            </w:r>
-          </w:p>
-        </w:tc>
-        <w:tc>
-          <w:tcPr>
-            <w:tcW w:w="300" w:type="dxa"/>
-            <w:tcMar>
-              <w:left w:w="0" w:type="dxa"/>
-              <w:right w:w="0" w:type="dxa"/>
-            </w:tcMar>
             <w:vAlign w:val="center"/>
           </w:tcPr>
           <w:p>
@@ -460,6 +354,7 @@
                 <w:color w:val="FFFFFF"/>
               </w:rPr>
             </w:pPr>
+            <w:bookmarkStart w:id="1" w:name="_Hlk89602339"/>
             <w:r>
               <w:rPr>
                 <w:noProof/>
@@ -481,13 +376,13 @@
                           <pic:cNvPicPr/>
                         </pic:nvPicPr>
                         <pic:blipFill>
-                          <a:blip r:embed="rId11" cstate="print">
+                          <a:blip r:embed="rId9" cstate="print">
                             <a:extLst>
                               <a:ext uri="{28A0092B-C50C-407E-A947-70E740481C1C}">
                                 <a14:useLocalDpi xmlns:a14="http://schemas.microsoft.com/office/drawing/2010/main" val="0"/>
                               </a:ext>
                               <a:ext uri="{96DAC541-7B7A-43D3-8B79-37D633B846F1}">
-                                <asvg:svgBlip xmlns:asvg="http://schemas.microsoft.com/office/drawing/2016/SVG/main" r:embed="rId12"/>
+                                <asvg:svgBlip xmlns:asvg="http://schemas.microsoft.com/office/drawing/2016/SVG/main" r:embed="rId10"/>
                               </a:ext>
                             </a:extLst>
                           </a:blip>
@@ -591,13 +486,13 @@
                           <pic:cNvPicPr/>
                         </pic:nvPicPr>
                         <pic:blipFill>
-                          <a:blip r:embed="rId13" cstate="print">
+                          <a:blip r:embed="rId11" cstate="print">
                             <a:extLst>
                               <a:ext uri="{28A0092B-C50C-407E-A947-70E740481C1C}">
                                 <a14:useLocalDpi xmlns:a14="http://schemas.microsoft.com/office/drawing/2010/main" val="0"/>
                               </a:ext>
                               <a:ext uri="{96DAC541-7B7A-43D3-8B79-37D633B846F1}">
-                                <asvg:svgBlip xmlns:asvg="http://schemas.microsoft.com/office/drawing/2016/SVG/main" r:embed="rId14"/>
+                                <asvg:svgBlip xmlns:asvg="http://schemas.microsoft.com/office/drawing/2016/SVG/main" r:embed="rId12"/>
                               </a:ext>
                             </a:extLst>
                           </a:blip>
@@ -642,7 +537,7 @@
             <w:r>
               <w:t xml:space="preserve"> </w:t>
             </w:r>
-            <w:hyperlink r:id="rId15" w:history="1">
+            <w:hyperlink r:id="rId13" w:history="1">
               <w:r>
                 <w:rPr>
                   <w:rStyle w:val="Hyperlink"/>
@@ -678,16 +573,6 @@
         </w:rPr>
         <w:tab/>
       </w:r>
-    </w:p>
-    <w:p>
-      <w:pPr>
-        <w:spacing w:after="0" w:line="200" w:lineRule="exact"/>
-        <w:rPr>
-          <w:sz w:val="20"/>
-          <w:szCs w:val="20"/>
-          <w:lang w:val="en-US"/>
-        </w:rPr>
-      </w:pPr>
     </w:p>
     <w:p>
       <w:pPr>
@@ -2348,351 +2233,187 @@
         <w:rPr>
           <w:rFonts w:ascii="Arial" w:eastAsia="Arial" w:hAnsi="Arial" w:cs="Arial"/>
           <w:color w:val="58524E"/>
-          <w:sz w:val="24"/>
-          <w:szCs w:val="20"/>
         </w:rPr>
       </w:pPr>
       <w:r>
         <w:rPr>
           <w:rFonts w:ascii="Arial" w:eastAsia="Arial" w:hAnsi="Arial" w:cs="Arial"/>
           <w:color w:val="58524E"/>
-          <w:sz w:val="24"/>
-          <w:szCs w:val="20"/>
         </w:rPr>
-        <w:t>Sviluppatore</w:t>
+        <w:t xml:space="preserve">Cloud Solution Architect con profonda esperienza nella progettazione e implementazione di soluzioni </w:t>
       </w:r>
+      <w:proofErr w:type="spellStart"/>
       <w:r>
         <w:rPr>
           <w:rFonts w:ascii="Arial" w:eastAsia="Arial" w:hAnsi="Arial" w:cs="Arial"/>
           <w:color w:val="58524E"/>
-          <w:sz w:val="24"/>
-          <w:szCs w:val="20"/>
         </w:rPr>
-        <w:t xml:space="preserve"> </w:t>
+        <w:t>enterprise</w:t>
       </w:r>
+      <w:proofErr w:type="spellEnd"/>
       <w:r>
         <w:rPr>
           <w:rFonts w:ascii="Arial" w:eastAsia="Arial" w:hAnsi="Arial" w:cs="Arial"/>
           <w:color w:val="58524E"/>
-          <w:sz w:val="24"/>
-          <w:szCs w:val="20"/>
         </w:rPr>
-        <w:t>f</w:t>
+        <w:t xml:space="preserve"> su Azure. Specializzato in Innovazione Applicativa, soluzioni </w:t>
       </w:r>
+      <w:proofErr w:type="gramStart"/>
       <w:r>
         <w:rPr>
           <w:rFonts w:ascii="Arial" w:eastAsia="Arial" w:hAnsi="Arial" w:cs="Arial"/>
           <w:color w:val="58524E"/>
-          <w:sz w:val="24"/>
-          <w:szCs w:val="20"/>
         </w:rPr>
-        <w:t xml:space="preserve">ull </w:t>
+        <w:t>AI</w:t>
       </w:r>
+      <w:proofErr w:type="gramEnd"/>
       <w:r>
         <w:rPr>
           <w:rFonts w:ascii="Arial" w:eastAsia="Arial" w:hAnsi="Arial" w:cs="Arial"/>
           <w:color w:val="58524E"/>
-          <w:sz w:val="24"/>
-          <w:szCs w:val="20"/>
         </w:rPr>
-        <w:t>s</w:t>
+        <w:t xml:space="preserve"> agent e pratiche di sviluppo moderne. Appassionato nell'aiutare le organizzazioni a trasformarsi attraverso architetture cloud-native e innovazione guidata dall'AI.</w:t>
       </w:r>
+    </w:p>
+    <w:p>
+      <w:pPr>
+        <w:spacing w:before="4" w:after="0"/>
+        <w:ind w:left="114" w:right="135"/>
+        <w:jc w:val="both"/>
+        <w:rPr>
+          <w:rFonts w:ascii="Arial" w:eastAsia="Arial" w:hAnsi="Arial" w:cs="Arial"/>
+          <w:color w:val="58524E"/>
+        </w:rPr>
+      </w:pPr>
+    </w:p>
+    <w:p>
+      <w:pPr>
+        <w:spacing w:before="4" w:after="0"/>
+        <w:ind w:left="114" w:right="135"/>
+        <w:jc w:val="both"/>
+        <w:rPr>
+          <w:rFonts w:ascii="Arial" w:eastAsia="Arial" w:hAnsi="Arial" w:cs="Arial"/>
+          <w:color w:val="58524E"/>
+        </w:rPr>
+      </w:pPr>
       <w:r>
         <w:rPr>
           <w:rFonts w:ascii="Arial" w:eastAsia="Arial" w:hAnsi="Arial" w:cs="Arial"/>
           <w:color w:val="58524E"/>
-          <w:sz w:val="24"/>
-          <w:szCs w:val="20"/>
         </w:rPr>
-        <w:t xml:space="preserve">tack, con una solida attitudine a lavorare </w:t>
+        <w:t xml:space="preserve">Eccello nel colmare il divario tra requisiti di business e soluzioni tecniche, sfruttando le capacità complete della piattaforma </w:t>
       </w:r>
+      <w:proofErr w:type="gramStart"/>
       <w:r>
         <w:rPr>
           <w:rFonts w:ascii="Arial" w:eastAsia="Arial" w:hAnsi="Arial" w:cs="Arial"/>
           <w:color w:val="58524E"/>
-          <w:sz w:val="24"/>
-          <w:szCs w:val="20"/>
         </w:rPr>
-        <w:t>s</w:t>
+        <w:t>Azure</w:t>
       </w:r>
+      <w:proofErr w:type="gramEnd"/>
       <w:r>
         <w:rPr>
           <w:rFonts w:ascii="Arial" w:eastAsia="Arial" w:hAnsi="Arial" w:cs="Arial"/>
           <w:color w:val="58524E"/>
-          <w:sz w:val="24"/>
-          <w:szCs w:val="20"/>
         </w:rPr>
-        <w:t>u architettura ed infrastruttura</w:t>
+        <w:t xml:space="preserve"> tra cui PaaS, </w:t>
       </w:r>
+      <w:proofErr w:type="spellStart"/>
       <w:r>
         <w:rPr>
           <w:rFonts w:ascii="Arial" w:eastAsia="Arial" w:hAnsi="Arial" w:cs="Arial"/>
           <w:color w:val="58524E"/>
-          <w:sz w:val="24"/>
-          <w:szCs w:val="20"/>
         </w:rPr>
-        <w:t>. Amo il codice pulito e di qualità. Ho sempre cura delle performance e della progettazione del software.</w:t>
+        <w:t>Serverless</w:t>
       </w:r>
+      <w:proofErr w:type="spellEnd"/>
       <w:r>
         <w:rPr>
           <w:rFonts w:ascii="Arial" w:eastAsia="Arial" w:hAnsi="Arial" w:cs="Arial"/>
           <w:color w:val="58524E"/>
-          <w:sz w:val="24"/>
-          <w:szCs w:val="20"/>
         </w:rPr>
-        <w:t xml:space="preserve"> </w:t>
+        <w:t xml:space="preserve">, Container e servizi AI. Esperto in pratiche DevOps, GitHub e GitHub </w:t>
       </w:r>
+      <w:proofErr w:type="spellStart"/>
       <w:r>
         <w:rPr>
           <w:rFonts w:ascii="Arial" w:eastAsia="Arial" w:hAnsi="Arial" w:cs="Arial"/>
           <w:color w:val="58524E"/>
-          <w:sz w:val="24"/>
-          <w:szCs w:val="20"/>
         </w:rPr>
-        <w:t xml:space="preserve">Seguo costantemente e sperimento le nuove tendenze </w:t>
+        <w:t>Copilot</w:t>
       </w:r>
+      <w:proofErr w:type="spellEnd"/>
       <w:r>
         <w:rPr>
           <w:rFonts w:ascii="Arial" w:eastAsia="Arial" w:hAnsi="Arial" w:cs="Arial"/>
           <w:color w:val="58524E"/>
-          <w:sz w:val="24"/>
-          <w:szCs w:val="20"/>
         </w:rPr>
-        <w:t>riguardanti</w:t>
+        <w:t xml:space="preserve">, pipeline CI/CD, Infrastructure </w:t>
       </w:r>
+      <w:proofErr w:type="spellStart"/>
       <w:r>
         <w:rPr>
           <w:rFonts w:ascii="Arial" w:eastAsia="Arial" w:hAnsi="Arial" w:cs="Arial"/>
           <w:color w:val="58524E"/>
-          <w:sz w:val="24"/>
-          <w:szCs w:val="20"/>
         </w:rPr>
-        <w:t xml:space="preserve"> </w:t>
+        <w:t>as</w:t>
       </w:r>
+      <w:proofErr w:type="spellEnd"/>
       <w:r>
         <w:rPr>
           <w:rFonts w:ascii="Arial" w:eastAsia="Arial" w:hAnsi="Arial" w:cs="Arial"/>
           <w:color w:val="58524E"/>
-          <w:sz w:val="24"/>
-          <w:szCs w:val="20"/>
         </w:rPr>
-        <w:t>cloud, web, mobile ed IoT</w:t>
+        <w:t xml:space="preserve"> Code (</w:t>
       </w:r>
+      <w:proofErr w:type="spellStart"/>
       <w:r>
         <w:rPr>
           <w:rFonts w:ascii="Arial" w:eastAsia="Arial" w:hAnsi="Arial" w:cs="Arial"/>
           <w:color w:val="58524E"/>
-          <w:sz w:val="24"/>
-          <w:szCs w:val="20"/>
         </w:rPr>
-        <w:t xml:space="preserve"> </w:t>
+        <w:t>IaC</w:t>
       </w:r>
+      <w:proofErr w:type="spellEnd"/>
       <w:r>
         <w:rPr>
           <w:rFonts w:ascii="Arial" w:eastAsia="Arial" w:hAnsi="Arial" w:cs="Arial"/>
           <w:color w:val="58524E"/>
-          <w:sz w:val="24"/>
-          <w:szCs w:val="20"/>
         </w:rPr>
-        <w:t>per offrire il più professionale</w:t>
+        <w:t xml:space="preserve">) e metodologie moderne di ingegneria del software (Agile, </w:t>
       </w:r>
+      <w:proofErr w:type="spellStart"/>
       <w:r>
         <w:rPr>
           <w:rFonts w:ascii="Arial" w:eastAsia="Arial" w:hAnsi="Arial" w:cs="Arial"/>
           <w:color w:val="58524E"/>
-          <w:sz w:val="24"/>
-          <w:szCs w:val="20"/>
         </w:rPr>
-        <w:t xml:space="preserve"> </w:t>
+        <w:t>Scrum</w:t>
       </w:r>
+      <w:proofErr w:type="spellEnd"/>
       <w:r>
         <w:rPr>
           <w:rFonts w:ascii="Arial" w:eastAsia="Arial" w:hAnsi="Arial" w:cs="Arial"/>
           <w:color w:val="58524E"/>
-          <w:sz w:val="24"/>
-          <w:szCs w:val="20"/>
         </w:rPr>
-        <w:t>supporto</w:t>
+        <w:t xml:space="preserve">, DevOps, Cloud Native, Microservizi). Guido engagement tecnici, architetto soluzioni e supporto </w:t>
       </w:r>
+      <w:proofErr w:type="gramStart"/>
       <w:r>
         <w:rPr>
           <w:rFonts w:ascii="Arial" w:eastAsia="Arial" w:hAnsi="Arial" w:cs="Arial"/>
           <w:color w:val="58524E"/>
-          <w:sz w:val="24"/>
-          <w:szCs w:val="20"/>
         </w:rPr>
-        <w:t xml:space="preserve"> possibile.</w:t>
+        <w:t>i team</w:t>
       </w:r>
+      <w:proofErr w:type="gramEnd"/>
       <w:r>
         <w:rPr>
           <w:rFonts w:ascii="Arial" w:eastAsia="Arial" w:hAnsi="Arial" w:cs="Arial"/>
           <w:color w:val="58524E"/>
-          <w:sz w:val="24"/>
-          <w:szCs w:val="20"/>
         </w:rPr>
-        <w:t xml:space="preserve"> Capacità di project / team management</w:t>
-      </w:r>
-      <w:r>
-        <w:rPr>
-          <w:rFonts w:ascii="Arial" w:eastAsia="Arial" w:hAnsi="Arial" w:cs="Arial"/>
-          <w:color w:val="58524E"/>
-          <w:sz w:val="24"/>
-          <w:szCs w:val="20"/>
-        </w:rPr>
-        <w:t>,</w:t>
-      </w:r>
-      <w:r>
-        <w:rPr>
-          <w:rFonts w:ascii="Arial" w:eastAsia="Arial" w:hAnsi="Arial" w:cs="Arial"/>
-          <w:color w:val="58524E"/>
-          <w:sz w:val="24"/>
-          <w:szCs w:val="20"/>
-        </w:rPr>
-        <w:t xml:space="preserve"> </w:t>
-      </w:r>
-      <w:r>
-        <w:rPr>
-          <w:rFonts w:ascii="Arial" w:eastAsia="Arial" w:hAnsi="Arial" w:cs="Arial"/>
-          <w:color w:val="58524E"/>
-          <w:sz w:val="24"/>
-          <w:szCs w:val="20"/>
-        </w:rPr>
-        <w:t xml:space="preserve">sviluppo software spingendo </w:t>
-      </w:r>
-      <w:r>
-        <w:rPr>
-          <w:rFonts w:ascii="Arial" w:eastAsia="Arial" w:hAnsi="Arial" w:cs="Arial"/>
-          <w:color w:val="58524E"/>
-          <w:sz w:val="24"/>
-          <w:szCs w:val="20"/>
-        </w:rPr>
-        <w:t>le più diffuse metodologie</w:t>
-      </w:r>
-      <w:r>
-        <w:rPr>
-          <w:rFonts w:ascii="Arial" w:eastAsia="Arial" w:hAnsi="Arial" w:cs="Arial"/>
-          <w:color w:val="58524E"/>
-          <w:sz w:val="24"/>
-          <w:szCs w:val="20"/>
-        </w:rPr>
-        <w:t>,</w:t>
-      </w:r>
-      <w:r>
-        <w:rPr>
-          <w:rFonts w:ascii="Arial" w:eastAsia="Arial" w:hAnsi="Arial" w:cs="Arial"/>
-          <w:color w:val="58524E"/>
-          <w:sz w:val="24"/>
-          <w:szCs w:val="20"/>
-        </w:rPr>
-        <w:t xml:space="preserve"> </w:t>
-      </w:r>
-      <w:r>
-        <w:rPr>
-          <w:rFonts w:ascii="Arial" w:eastAsia="Arial" w:hAnsi="Arial" w:cs="Arial"/>
-          <w:color w:val="58524E"/>
-          <w:sz w:val="24"/>
-          <w:szCs w:val="20"/>
-        </w:rPr>
-        <w:t>pratiche</w:t>
-      </w:r>
-      <w:r>
-        <w:rPr>
-          <w:rFonts w:ascii="Arial" w:eastAsia="Arial" w:hAnsi="Arial" w:cs="Arial"/>
-          <w:color w:val="58524E"/>
-          <w:sz w:val="24"/>
-          <w:szCs w:val="20"/>
-        </w:rPr>
-        <w:t xml:space="preserve"> e tecnologie</w:t>
-      </w:r>
-      <w:r>
-        <w:rPr>
-          <w:rFonts w:ascii="Arial" w:eastAsia="Arial" w:hAnsi="Arial" w:cs="Arial"/>
-          <w:color w:val="58524E"/>
-          <w:sz w:val="24"/>
-          <w:szCs w:val="20"/>
-        </w:rPr>
-        <w:t xml:space="preserve"> (</w:t>
-      </w:r>
-      <w:r>
-        <w:rPr>
-          <w:rFonts w:ascii="Arial" w:eastAsia="Arial" w:hAnsi="Arial" w:cs="Arial"/>
-          <w:color w:val="58524E"/>
-          <w:sz w:val="24"/>
-          <w:szCs w:val="20"/>
-        </w:rPr>
-        <w:t xml:space="preserve">Kanban, Agile, Scrum, xP, TDD, </w:t>
-      </w:r>
-      <w:r>
-        <w:rPr>
-          <w:rFonts w:ascii="Arial" w:eastAsia="Arial" w:hAnsi="Arial" w:cs="Arial"/>
-          <w:color w:val="58524E"/>
-          <w:sz w:val="24"/>
-          <w:szCs w:val="20"/>
-        </w:rPr>
-        <w:t xml:space="preserve">DevOps, </w:t>
-      </w:r>
-      <w:r>
-        <w:rPr>
-          <w:rFonts w:ascii="Arial" w:eastAsia="Arial" w:hAnsi="Arial" w:cs="Arial"/>
-          <w:color w:val="58524E"/>
-          <w:sz w:val="24"/>
-          <w:szCs w:val="20"/>
-        </w:rPr>
-        <w:t>CI/CD, IaC</w:t>
-      </w:r>
-      <w:r>
-        <w:rPr>
-          <w:rFonts w:ascii="Arial" w:eastAsia="Arial" w:hAnsi="Arial" w:cs="Arial"/>
-          <w:color w:val="58524E"/>
-          <w:sz w:val="24"/>
-          <w:szCs w:val="20"/>
-        </w:rPr>
-        <w:t>,</w:t>
-      </w:r>
-      <w:r>
-        <w:rPr>
-          <w:rFonts w:ascii="Arial" w:eastAsia="Arial" w:hAnsi="Arial" w:cs="Arial"/>
-          <w:color w:val="58524E"/>
-          <w:sz w:val="24"/>
-          <w:szCs w:val="20"/>
-        </w:rPr>
-        <w:t xml:space="preserve"> Cloud Native,</w:t>
-      </w:r>
-      <w:r>
-        <w:rPr>
-          <w:rFonts w:ascii="Arial" w:eastAsia="Arial" w:hAnsi="Arial" w:cs="Arial"/>
-          <w:color w:val="58524E"/>
-          <w:sz w:val="24"/>
-          <w:szCs w:val="20"/>
-        </w:rPr>
-        <w:t xml:space="preserve"> Microservizi</w:t>
-      </w:r>
-      <w:r>
-        <w:rPr>
-          <w:rFonts w:ascii="Arial" w:eastAsia="Arial" w:hAnsi="Arial" w:cs="Arial"/>
-          <w:color w:val="58524E"/>
-          <w:sz w:val="24"/>
-          <w:szCs w:val="20"/>
-        </w:rPr>
-        <w:t>, AI</w:t>
-      </w:r>
-      <w:r>
-        <w:rPr>
-          <w:rFonts w:ascii="Arial" w:eastAsia="Arial" w:hAnsi="Arial" w:cs="Arial"/>
-          <w:color w:val="58524E"/>
-          <w:sz w:val="24"/>
-          <w:szCs w:val="20"/>
-        </w:rPr>
-        <w:t>)</w:t>
-      </w:r>
-      <w:r>
-        <w:rPr>
-          <w:rFonts w:ascii="Arial" w:eastAsia="Arial" w:hAnsi="Arial" w:cs="Arial"/>
-          <w:color w:val="58524E"/>
-          <w:sz w:val="24"/>
-          <w:szCs w:val="20"/>
-        </w:rPr>
-        <w:t>.</w:t>
+        <w:t xml:space="preserve"> di sviluppo nella creazione di applicazioni cloud scalabili, sicure ed economicamente efficienti.</w:t>
       </w:r>
     </w:p>
     <w:p>
@@ -4799,22 +4520,174 @@
                 <w:color w:val="58524E"/>
                 <w:lang w:eastAsia="en-US"/>
               </w:rPr>
-              <w:t xml:space="preserve">Docker; Kubernetes; .NET; ASP.NET (Razor Pages, MVC, SignalR, WebApi, Web Forms); </w:t>
-            </w:r>
-            <w:r>
-              <w:rPr>
-                <w:rFonts w:ascii="Arial" w:eastAsia="Arial" w:hAnsi="Arial" w:cs="Arial"/>
-                <w:color w:val="58524E"/>
-              </w:rPr>
-              <w:t xml:space="preserve">Blazor; </w:t>
-            </w:r>
-            <w:r>
-              <w:rPr>
-                <w:rFonts w:ascii="Arial" w:eastAsia="Arial" w:hAnsi="Arial" w:cs="Arial"/>
-                <w:color w:val="58524E"/>
-                <w:lang w:eastAsia="en-US"/>
-              </w:rPr>
-              <w:t>EntityFramework; MAUI; Windows Forms; WPF; Angular; React; Ajax; jQuery; Bootstrap; NodeJS; Rest API; Web Services SOAP;</w:t>
+              <w:t xml:space="preserve">Docker; </w:t>
+            </w:r>
+            <w:proofErr w:type="spellStart"/>
+            <w:r>
+              <w:rPr>
+                <w:rFonts w:ascii="Arial" w:eastAsia="Arial" w:hAnsi="Arial" w:cs="Arial"/>
+                <w:color w:val="58524E"/>
+                <w:lang w:eastAsia="en-US"/>
+              </w:rPr>
+              <w:t>Kubernetes</w:t>
+            </w:r>
+            <w:proofErr w:type="spellEnd"/>
+            <w:r>
+              <w:rPr>
+                <w:rFonts w:ascii="Arial" w:eastAsia="Arial" w:hAnsi="Arial" w:cs="Arial"/>
+                <w:color w:val="58524E"/>
+                <w:lang w:eastAsia="en-US"/>
+              </w:rPr>
+              <w:t>; .NET; ASP.NET (</w:t>
+            </w:r>
+            <w:r>
+              <w:rPr>
+                <w:rFonts w:ascii="Arial" w:eastAsia="Arial" w:hAnsi="Arial" w:cs="Arial"/>
+                <w:color w:val="58524E"/>
+                <w:lang w:eastAsia="en-US"/>
+              </w:rPr>
+              <w:t xml:space="preserve">Blazor, </w:t>
+            </w:r>
+            <w:r>
+              <w:rPr>
+                <w:rFonts w:ascii="Arial" w:eastAsia="Arial" w:hAnsi="Arial" w:cs="Arial"/>
+                <w:color w:val="58524E"/>
+                <w:lang w:eastAsia="en-US"/>
+              </w:rPr>
+              <w:t xml:space="preserve">Razor Pages, MVC, </w:t>
+            </w:r>
+            <w:proofErr w:type="spellStart"/>
+            <w:r>
+              <w:rPr>
+                <w:rFonts w:ascii="Arial" w:eastAsia="Arial" w:hAnsi="Arial" w:cs="Arial"/>
+                <w:color w:val="58524E"/>
+                <w:lang w:eastAsia="en-US"/>
+              </w:rPr>
+              <w:t>SignalR</w:t>
+            </w:r>
+            <w:proofErr w:type="spellEnd"/>
+            <w:r>
+              <w:rPr>
+                <w:rFonts w:ascii="Arial" w:eastAsia="Arial" w:hAnsi="Arial" w:cs="Arial"/>
+                <w:color w:val="58524E"/>
+                <w:lang w:eastAsia="en-US"/>
+              </w:rPr>
+              <w:t xml:space="preserve">, </w:t>
+            </w:r>
+            <w:proofErr w:type="spellStart"/>
+            <w:r>
+              <w:rPr>
+                <w:rFonts w:ascii="Arial" w:eastAsia="Arial" w:hAnsi="Arial" w:cs="Arial"/>
+                <w:color w:val="58524E"/>
+                <w:lang w:eastAsia="en-US"/>
+              </w:rPr>
+              <w:t>WebApi</w:t>
+            </w:r>
+            <w:proofErr w:type="spellEnd"/>
+            <w:r>
+              <w:rPr>
+                <w:rFonts w:ascii="Arial" w:eastAsia="Arial" w:hAnsi="Arial" w:cs="Arial"/>
+                <w:color w:val="58524E"/>
+                <w:lang w:eastAsia="en-US"/>
+              </w:rPr>
+              <w:t>, Web Forms)</w:t>
+            </w:r>
+            <w:r>
+              <w:rPr>
+                <w:rFonts w:ascii="Arial" w:eastAsia="Arial" w:hAnsi="Arial" w:cs="Arial"/>
+                <w:color w:val="58524E"/>
+              </w:rPr>
+              <w:t xml:space="preserve">; </w:t>
+            </w:r>
+            <w:proofErr w:type="spellStart"/>
+            <w:r>
+              <w:rPr>
+                <w:rFonts w:ascii="Arial" w:eastAsia="Arial" w:hAnsi="Arial" w:cs="Arial"/>
+                <w:color w:val="58524E"/>
+                <w:lang w:eastAsia="en-US"/>
+              </w:rPr>
+              <w:t>EntityFramework</w:t>
+            </w:r>
+            <w:proofErr w:type="spellEnd"/>
+            <w:r>
+              <w:rPr>
+                <w:rFonts w:ascii="Arial" w:eastAsia="Arial" w:hAnsi="Arial" w:cs="Arial"/>
+                <w:color w:val="58524E"/>
+                <w:lang w:eastAsia="en-US"/>
+              </w:rPr>
+              <w:t xml:space="preserve">; MAUI; Windows Forms; WPF; </w:t>
+            </w:r>
+            <w:proofErr w:type="spellStart"/>
+            <w:r>
+              <w:rPr>
+                <w:rFonts w:ascii="Arial" w:eastAsia="Arial" w:hAnsi="Arial" w:cs="Arial"/>
+                <w:color w:val="58524E"/>
+                <w:lang w:eastAsia="en-US"/>
+              </w:rPr>
+              <w:t>Angular</w:t>
+            </w:r>
+            <w:proofErr w:type="spellEnd"/>
+            <w:r>
+              <w:rPr>
+                <w:rFonts w:ascii="Arial" w:eastAsia="Arial" w:hAnsi="Arial" w:cs="Arial"/>
+                <w:color w:val="58524E"/>
+                <w:lang w:eastAsia="en-US"/>
+              </w:rPr>
+              <w:t xml:space="preserve">; React; Ajax; </w:t>
+            </w:r>
+            <w:proofErr w:type="spellStart"/>
+            <w:r>
+              <w:rPr>
+                <w:rFonts w:ascii="Arial" w:eastAsia="Arial" w:hAnsi="Arial" w:cs="Arial"/>
+                <w:color w:val="58524E"/>
+                <w:lang w:eastAsia="en-US"/>
+              </w:rPr>
+              <w:t>jQuery</w:t>
+            </w:r>
+            <w:proofErr w:type="spellEnd"/>
+            <w:r>
+              <w:rPr>
+                <w:rFonts w:ascii="Arial" w:eastAsia="Arial" w:hAnsi="Arial" w:cs="Arial"/>
+                <w:color w:val="58524E"/>
+                <w:lang w:eastAsia="en-US"/>
+              </w:rPr>
+              <w:t xml:space="preserve">; Bootstrap; </w:t>
+            </w:r>
+            <w:proofErr w:type="spellStart"/>
+            <w:r>
+              <w:rPr>
+                <w:rFonts w:ascii="Arial" w:eastAsia="Arial" w:hAnsi="Arial" w:cs="Arial"/>
+                <w:color w:val="58524E"/>
+                <w:lang w:eastAsia="en-US"/>
+              </w:rPr>
+              <w:t>NodeJS</w:t>
+            </w:r>
+            <w:proofErr w:type="spellEnd"/>
+            <w:r>
+              <w:rPr>
+                <w:rFonts w:ascii="Arial" w:eastAsia="Arial" w:hAnsi="Arial" w:cs="Arial"/>
+                <w:color w:val="58524E"/>
+                <w:lang w:eastAsia="en-US"/>
+              </w:rPr>
+              <w:t xml:space="preserve">; </w:t>
+            </w:r>
+            <w:proofErr w:type="spellStart"/>
+            <w:r>
+              <w:rPr>
+                <w:rFonts w:ascii="Arial" w:eastAsia="Arial" w:hAnsi="Arial" w:cs="Arial"/>
+                <w:color w:val="58524E"/>
+                <w:lang w:eastAsia="en-US"/>
+              </w:rPr>
+              <w:t>Rest</w:t>
+            </w:r>
+            <w:proofErr w:type="spellEnd"/>
+            <w:r>
+              <w:rPr>
+                <w:rFonts w:ascii="Arial" w:eastAsia="Arial" w:hAnsi="Arial" w:cs="Arial"/>
+                <w:color w:val="58524E"/>
+                <w:lang w:eastAsia="en-US"/>
+              </w:rPr>
+              <w:t xml:space="preserve"> API; Web Services SOAP;</w:t>
             </w:r>
           </w:p>
         </w:tc>
@@ -4922,7 +4795,25 @@
                 <w:color w:val="58524E"/>
                 <w:lang w:val="en-US" w:eastAsia="en-US"/>
               </w:rPr>
-              <w:t xml:space="preserve"> CosmosDB;</w:t>
+              <w:t xml:space="preserve"> </w:t>
+            </w:r>
+            <w:proofErr w:type="spellStart"/>
+            <w:r>
+              <w:rPr>
+                <w:rFonts w:ascii="Arial" w:eastAsia="Arial" w:hAnsi="Arial" w:cs="Arial"/>
+                <w:color w:val="58524E"/>
+                <w:lang w:val="en-US" w:eastAsia="en-US"/>
+              </w:rPr>
+              <w:t>CosmosDB</w:t>
+            </w:r>
+            <w:proofErr w:type="spellEnd"/>
+            <w:r>
+              <w:rPr>
+                <w:rFonts w:ascii="Arial" w:eastAsia="Arial" w:hAnsi="Arial" w:cs="Arial"/>
+                <w:color w:val="58524E"/>
+                <w:lang w:val="en-US" w:eastAsia="en-US"/>
+              </w:rPr>
+              <w:t>;</w:t>
             </w:r>
             <w:r>
               <w:rPr>
@@ -5006,7 +4897,7 @@
                 <w:sz w:val="20"/>
                 <w:szCs w:val="20"/>
               </w:rPr>
-              <w:t>Project/Team Management</w:t>
+              <w:t>Piattaforme SDLC</w:t>
             </w:r>
           </w:p>
         </w:tc>
@@ -5048,38 +4939,6 @@
                 <w:lang w:val="en-US" w:eastAsia="en-US"/>
               </w:rPr>
               <w:t>;</w:t>
-            </w:r>
-            <w:r>
-              <w:rPr>
-                <w:rFonts w:ascii="Arial" w:eastAsia="Arial" w:hAnsi="Arial" w:cs="Arial"/>
-                <w:color w:val="58524E"/>
-                <w:lang w:val="en-US" w:eastAsia="en-US"/>
-              </w:rPr>
-              <w:t xml:space="preserve"> Microsoft Teams; </w:t>
-            </w:r>
-            <w:r>
-              <w:rPr>
-                <w:rFonts w:ascii="Arial" w:eastAsia="Arial" w:hAnsi="Arial" w:cs="Arial"/>
-                <w:color w:val="58524E"/>
-                <w:lang w:val="en-US" w:eastAsia="en-US"/>
-              </w:rPr>
-              <w:t>Trello; Slack; Microsoft Project;</w:t>
-            </w:r>
-            <w:r>
-              <w:rPr>
-                <w:rFonts w:ascii="Arial" w:eastAsia="Arial" w:hAnsi="Arial" w:cs="Arial"/>
-                <w:color w:val="58524E"/>
-                <w:lang w:val="en-US" w:eastAsia="en-US"/>
-              </w:rPr>
-              <w:t xml:space="preserve"> </w:t>
-            </w:r>
-            <w:r>
-              <w:rPr>
-                <w:rFonts w:ascii="Arial" w:eastAsia="Arial" w:hAnsi="Arial" w:cs="Arial"/>
-                <w:color w:val="58524E"/>
-                <w:lang w:val="en-US" w:eastAsia="en-US"/>
-              </w:rPr>
-              <w:t>GitLab;</w:t>
             </w:r>
           </w:p>
         </w:tc>
@@ -7283,13 +7142,13 @@
                     <pic:cNvPicPr/>
                   </pic:nvPicPr>
                   <pic:blipFill>
-                    <a:blip r:embed="rId16">
+                    <a:blip r:embed="rId14">
                       <a:extLst>
                         <a:ext uri="{28A0092B-C50C-407E-A947-70E740481C1C}">
                           <a14:useLocalDpi xmlns:a14="http://schemas.microsoft.com/office/drawing/2010/main" val="0"/>
                         </a:ext>
                         <a:ext uri="{96DAC541-7B7A-43D3-8B79-37D633B846F1}">
-                          <asvg:svgBlip xmlns:asvg="http://schemas.microsoft.com/office/drawing/2016/SVG/main" r:embed="rId17"/>
+                          <asvg:svgBlip xmlns:asvg="http://schemas.microsoft.com/office/drawing/2016/SVG/main" r:embed="rId15"/>
                         </a:ext>
                       </a:extLst>
                     </a:blip>
@@ -7463,6 +7322,7 @@
         </w:rPr>
         <w:t xml:space="preserve"> </w:t>
       </w:r>
+      <w:proofErr w:type="spellStart"/>
       <w:r>
         <w:rPr>
           <w:rFonts w:ascii="Georgia" w:eastAsia="Georgia" w:hAnsi="Georgia" w:cs="Georgia"/>
@@ -7474,6 +7334,7 @@
         </w:rPr>
         <w:t>Certificazioni</w:t>
       </w:r>
+      <w:proofErr w:type="spellEnd"/>
     </w:p>
     <w:p>
       <w:pPr>
@@ -10190,40 +10051,108 @@
                 <w:color w:val="58524E"/>
                 <w:lang w:eastAsia="en-US"/>
               </w:rPr>
-              <w:t>Sono il responsabile dell’utilizzo</w:t>
-            </w:r>
-            <w:r>
-              <w:rPr>
-                <w:rFonts w:ascii="Arial" w:eastAsia="Arial" w:hAnsi="Arial" w:cs="Arial"/>
-                <w:color w:val="58524E"/>
-                <w:lang w:eastAsia="en-US"/>
-              </w:rPr>
-              <w:t xml:space="preserve"> tecnic</w:t>
-            </w:r>
-            <w:r>
-              <w:rPr>
-                <w:rFonts w:ascii="Arial" w:eastAsia="Arial" w:hAnsi="Arial" w:cs="Arial"/>
-                <w:color w:val="58524E"/>
-                <w:lang w:eastAsia="en-US"/>
-              </w:rPr>
-              <w:t>o</w:t>
-            </w:r>
-            <w:r>
-              <w:rPr>
-                <w:rFonts w:ascii="Arial" w:eastAsia="Arial" w:hAnsi="Arial" w:cs="Arial"/>
-                <w:color w:val="58524E"/>
-                <w:lang w:eastAsia="en-US"/>
-              </w:rPr>
-              <w:t xml:space="preserve"> complessiv</w:t>
-            </w:r>
-            <w:r>
-              <w:rPr>
-                <w:rFonts w:ascii="Arial" w:eastAsia="Arial" w:hAnsi="Arial" w:cs="Arial"/>
-                <w:color w:val="58524E"/>
-                <w:lang w:eastAsia="en-US"/>
-              </w:rPr>
-              <w:t>o</w:t>
-            </w:r>
+              <w:t xml:space="preserve">Guido engagement tecnici nell'area Cloud e AI Solutions, specializzandomi in Innovazione Applicativa. Architetto e guido l'implementazione di soluzioni </w:t>
+            </w:r>
+            <w:proofErr w:type="spellStart"/>
+            <w:r>
+              <w:rPr>
+                <w:rFonts w:ascii="Arial" w:eastAsia="Arial" w:hAnsi="Arial" w:cs="Arial"/>
+                <w:color w:val="58524E"/>
+                <w:lang w:eastAsia="en-US"/>
+              </w:rPr>
+              <w:t>enterprise</w:t>
+            </w:r>
+            <w:proofErr w:type="spellEnd"/>
+            <w:r>
+              <w:rPr>
+                <w:rFonts w:ascii="Arial" w:eastAsia="Arial" w:hAnsi="Arial" w:cs="Arial"/>
+                <w:color w:val="58524E"/>
+                <w:lang w:eastAsia="en-US"/>
+              </w:rPr>
+              <w:t xml:space="preserve"> su Azure, aiutando i clienti a sfruttare le più avanzate capacità di </w:t>
+            </w:r>
+            <w:proofErr w:type="gramStart"/>
+            <w:r>
+              <w:rPr>
+                <w:rFonts w:ascii="Arial" w:eastAsia="Arial" w:hAnsi="Arial" w:cs="Arial"/>
+                <w:color w:val="58524E"/>
+                <w:lang w:eastAsia="en-US"/>
+              </w:rPr>
+              <w:t>AI</w:t>
+            </w:r>
+            <w:proofErr w:type="gramEnd"/>
+            <w:r>
+              <w:rPr>
+                <w:rFonts w:ascii="Arial" w:eastAsia="Arial" w:hAnsi="Arial" w:cs="Arial"/>
+                <w:color w:val="58524E"/>
+                <w:lang w:eastAsia="en-US"/>
+              </w:rPr>
+              <w:t xml:space="preserve"> agent, piattaforme applicative moderne e pratiche DevOps. Conduco sessioni di progettazione architetturale, sviluppo </w:t>
+            </w:r>
+            <w:proofErr w:type="spellStart"/>
+            <w:r>
+              <w:rPr>
+                <w:rFonts w:ascii="Arial" w:eastAsia="Arial" w:hAnsi="Arial" w:cs="Arial"/>
+                <w:color w:val="58524E"/>
+                <w:lang w:eastAsia="en-US"/>
+              </w:rPr>
+              <w:t>proof</w:t>
+            </w:r>
+            <w:proofErr w:type="spellEnd"/>
+            <w:r>
+              <w:rPr>
+                <w:rFonts w:ascii="Arial" w:eastAsia="Arial" w:hAnsi="Arial" w:cs="Arial"/>
+                <w:color w:val="58524E"/>
+                <w:lang w:eastAsia="en-US"/>
+              </w:rPr>
+              <w:t xml:space="preserve">-of-concept e guido l'adozione tecnica dei servizi </w:t>
+            </w:r>
+            <w:proofErr w:type="gramStart"/>
+            <w:r>
+              <w:rPr>
+                <w:rFonts w:ascii="Arial" w:eastAsia="Arial" w:hAnsi="Arial" w:cs="Arial"/>
+                <w:color w:val="58524E"/>
+                <w:lang w:eastAsia="en-US"/>
+              </w:rPr>
+              <w:t>Azure</w:t>
+            </w:r>
+            <w:proofErr w:type="gramEnd"/>
+            <w:r>
+              <w:rPr>
+                <w:rFonts w:ascii="Arial" w:eastAsia="Arial" w:hAnsi="Arial" w:cs="Arial"/>
+                <w:color w:val="58524E"/>
+                <w:lang w:eastAsia="en-US"/>
+              </w:rPr>
+              <w:t xml:space="preserve"> tra cui AI, container, </w:t>
+            </w:r>
+            <w:proofErr w:type="spellStart"/>
+            <w:r>
+              <w:rPr>
+                <w:rFonts w:ascii="Arial" w:eastAsia="Arial" w:hAnsi="Arial" w:cs="Arial"/>
+                <w:color w:val="58524E"/>
+                <w:lang w:eastAsia="en-US"/>
+              </w:rPr>
+              <w:t>serverless</w:t>
+            </w:r>
+            <w:proofErr w:type="spellEnd"/>
+            <w:r>
+              <w:rPr>
+                <w:rFonts w:ascii="Arial" w:eastAsia="Arial" w:hAnsi="Arial" w:cs="Arial"/>
+                <w:color w:val="58524E"/>
+                <w:lang w:eastAsia="en-US"/>
+              </w:rPr>
+              <w:t xml:space="preserve"> e architetture cloud-native. </w:t>
+            </w:r>
+            <w:proofErr w:type="gramStart"/>
+            <w:r>
+              <w:rPr>
+                <w:rFonts w:ascii="Arial" w:eastAsia="Arial" w:hAnsi="Arial" w:cs="Arial"/>
+                <w:color w:val="58524E"/>
+                <w:lang w:eastAsia="en-US"/>
+              </w:rPr>
+              <w:t>Supporto inoltre</w:t>
+            </w:r>
+            <w:proofErr w:type="gramEnd"/>
             <w:r>
               <w:rPr>
                 <w:rFonts w:ascii="Arial" w:eastAsia="Arial" w:hAnsi="Arial" w:cs="Arial"/>
@@ -10232,117 +10161,41 @@
               </w:rPr>
               <w:t xml:space="preserve"> </w:t>
             </w:r>
-            <w:r>
-              <w:rPr>
-                <w:rFonts w:ascii="Arial" w:eastAsia="Arial" w:hAnsi="Arial" w:cs="Arial"/>
-                <w:color w:val="58524E"/>
-                <w:lang w:eastAsia="en-US"/>
-              </w:rPr>
-              <w:t>del</w:t>
-            </w:r>
-            <w:r>
-              <w:rPr>
-                <w:rFonts w:ascii="Arial" w:eastAsia="Arial" w:hAnsi="Arial" w:cs="Arial"/>
-                <w:color w:val="58524E"/>
-                <w:lang w:eastAsia="en-US"/>
-              </w:rPr>
-              <w:t>la piattaforma di sviluppo di applicazioni Microsoft Azure</w:t>
-            </w:r>
-            <w:r>
-              <w:rPr>
-                <w:rFonts w:ascii="Arial" w:eastAsia="Arial" w:hAnsi="Arial" w:cs="Arial"/>
-                <w:color w:val="58524E"/>
-                <w:lang w:eastAsia="en-US"/>
-              </w:rPr>
-              <w:t xml:space="preserve"> da parte dei clienti</w:t>
-            </w:r>
-            <w:r>
-              <w:rPr>
-                <w:rFonts w:ascii="Arial" w:eastAsia="Arial" w:hAnsi="Arial" w:cs="Arial"/>
-                <w:color w:val="58524E"/>
-                <w:lang w:eastAsia="en-US"/>
-              </w:rPr>
-              <w:t xml:space="preserve">. </w:t>
-            </w:r>
-            <w:r>
-              <w:rPr>
-                <w:rFonts w:ascii="Arial" w:eastAsia="Arial" w:hAnsi="Arial" w:cs="Arial"/>
-                <w:color w:val="58524E"/>
-                <w:lang w:eastAsia="en-US"/>
-              </w:rPr>
-              <w:t>Contribuisco</w:t>
-            </w:r>
-            <w:r>
-              <w:rPr>
-                <w:rFonts w:ascii="Arial" w:eastAsia="Arial" w:hAnsi="Arial" w:cs="Arial"/>
-                <w:color w:val="58524E"/>
-                <w:lang w:eastAsia="en-US"/>
-              </w:rPr>
-              <w:t xml:space="preserve"> agli </w:t>
-            </w:r>
-            <w:r>
-              <w:rPr>
-                <w:rFonts w:ascii="Arial" w:eastAsia="Arial" w:hAnsi="Arial" w:cs="Arial"/>
-                <w:color w:val="58524E"/>
-                <w:lang w:eastAsia="en-US"/>
-              </w:rPr>
-              <w:t>ingaggi</w:t>
-            </w:r>
-            <w:r>
-              <w:rPr>
-                <w:rFonts w:ascii="Arial" w:eastAsia="Arial" w:hAnsi="Arial" w:cs="Arial"/>
-                <w:color w:val="58524E"/>
-                <w:lang w:eastAsia="en-US"/>
-              </w:rPr>
-              <w:t xml:space="preserve"> tecnici per lo sviluppo di applicazioni </w:t>
-            </w:r>
-            <w:r>
-              <w:rPr>
-                <w:rFonts w:ascii="Arial" w:eastAsia="Arial" w:hAnsi="Arial" w:cs="Arial"/>
-                <w:color w:val="58524E"/>
-                <w:lang w:eastAsia="en-US"/>
-              </w:rPr>
-              <w:t xml:space="preserve">basate su </w:t>
-            </w:r>
-            <w:r>
-              <w:rPr>
-                <w:rFonts w:ascii="Arial" w:eastAsia="Arial" w:hAnsi="Arial" w:cs="Arial"/>
-                <w:color w:val="58524E"/>
-                <w:lang w:eastAsia="en-US"/>
-              </w:rPr>
-              <w:t>Azure</w:t>
-            </w:r>
-            <w:r>
-              <w:rPr>
-                <w:rFonts w:ascii="Arial" w:eastAsia="Arial" w:hAnsi="Arial" w:cs="Arial"/>
-                <w:color w:val="58524E"/>
-                <w:lang w:eastAsia="en-US"/>
-              </w:rPr>
-              <w:t xml:space="preserve"> che includono </w:t>
-            </w:r>
-            <w:r>
-              <w:rPr>
-                <w:rFonts w:ascii="Arial" w:eastAsia="Arial" w:hAnsi="Arial" w:cs="Arial"/>
-                <w:color w:val="58524E"/>
-                <w:lang w:eastAsia="en-US"/>
-              </w:rPr>
-              <w:t xml:space="preserve">sessioni di progettazione </w:t>
-            </w:r>
-            <w:r>
-              <w:rPr>
-                <w:rFonts w:ascii="Arial" w:eastAsia="Arial" w:hAnsi="Arial" w:cs="Arial"/>
-                <w:color w:val="58524E"/>
-                <w:lang w:eastAsia="en-US"/>
-              </w:rPr>
-              <w:t>architetturale</w:t>
-            </w:r>
-            <w:r>
-              <w:rPr>
-                <w:rFonts w:ascii="Arial" w:eastAsia="Arial" w:hAnsi="Arial" w:cs="Arial"/>
-                <w:color w:val="58524E"/>
-                <w:lang w:eastAsia="en-US"/>
-              </w:rPr>
-              <w:t>, progetti di implementazione specifici e/o progetti pilota.</w:t>
+            <w:proofErr w:type="gramStart"/>
+            <w:r>
+              <w:rPr>
+                <w:rFonts w:ascii="Arial" w:eastAsia="Arial" w:hAnsi="Arial" w:cs="Arial"/>
+                <w:color w:val="58524E"/>
+                <w:lang w:eastAsia="en-US"/>
+              </w:rPr>
+              <w:t>i team</w:t>
+            </w:r>
+            <w:proofErr w:type="gramEnd"/>
+            <w:r>
+              <w:rPr>
+                <w:rFonts w:ascii="Arial" w:eastAsia="Arial" w:hAnsi="Arial" w:cs="Arial"/>
+                <w:color w:val="58524E"/>
+                <w:lang w:eastAsia="en-US"/>
+              </w:rPr>
+              <w:t xml:space="preserve"> di sviluppo attraverso l'expertise in GitHub e GitHub </w:t>
+            </w:r>
+            <w:proofErr w:type="spellStart"/>
+            <w:r>
+              <w:rPr>
+                <w:rFonts w:ascii="Arial" w:eastAsia="Arial" w:hAnsi="Arial" w:cs="Arial"/>
+                <w:color w:val="58524E"/>
+                <w:lang w:eastAsia="en-US"/>
+              </w:rPr>
+              <w:t>Copilot</w:t>
+            </w:r>
+            <w:proofErr w:type="spellEnd"/>
+            <w:r>
+              <w:rPr>
+                <w:rFonts w:ascii="Arial" w:eastAsia="Arial" w:hAnsi="Arial" w:cs="Arial"/>
+                <w:color w:val="58524E"/>
+                <w:lang w:eastAsia="en-US"/>
+              </w:rPr>
+              <w:t>, permettendo loro di costruire software migliore più velocemente.</w:t>
             </w:r>
           </w:p>
           <w:p>
@@ -10371,7 +10224,6 @@
                 <w:color w:val="4F81BD" w:themeColor="accent1"/>
                 <w:sz w:val="24"/>
                 <w:szCs w:val="24"/>
-                <w:lang w:val="en-US"/>
               </w:rPr>
             </w:pPr>
             <w:r>
@@ -10379,7 +10231,6 @@
                 <w:rFonts w:ascii="Arial" w:eastAsia="Arial" w:hAnsi="Arial" w:cs="Arial"/>
                 <w:b/>
                 <w:color w:val="58524E"/>
-                <w:lang w:val="en-US"/>
               </w:rPr>
               <w:t xml:space="preserve">Tecnologie: </w:t>
             </w:r>
@@ -10389,9 +10240,173 @@
                 <w:color w:val="58524E"/>
                 <w:sz w:val="20"/>
                 <w:szCs w:val="20"/>
-                <w:lang w:val="en-US"/>
-              </w:rPr>
-              <w:t>Azure (IaaS, PaaS, Serverless, Container), DevOps, GitHub, .NET, Visual Studio</w:t>
+              </w:rPr>
+              <w:t xml:space="preserve">Azure AI </w:t>
+            </w:r>
+            <w:proofErr w:type="spellStart"/>
+            <w:r>
+              <w:rPr>
+                <w:rFonts w:ascii="Arial" w:eastAsia="Arial" w:hAnsi="Arial" w:cs="Arial"/>
+                <w:color w:val="58524E"/>
+                <w:sz w:val="20"/>
+                <w:szCs w:val="20"/>
+              </w:rPr>
+              <w:t>Foundry</w:t>
+            </w:r>
+            <w:proofErr w:type="spellEnd"/>
+            <w:r>
+              <w:rPr>
+                <w:rFonts w:ascii="Arial" w:eastAsia="Arial" w:hAnsi="Arial" w:cs="Arial"/>
+                <w:color w:val="58524E"/>
+                <w:sz w:val="20"/>
+                <w:szCs w:val="20"/>
+              </w:rPr>
+              <w:t xml:space="preserve"> (</w:t>
+            </w:r>
+            <w:r>
+              <w:rPr>
+                <w:rFonts w:ascii="Arial" w:eastAsia="Arial" w:hAnsi="Arial" w:cs="Arial"/>
+                <w:color w:val="58524E"/>
+                <w:sz w:val="20"/>
+                <w:szCs w:val="20"/>
+              </w:rPr>
+              <w:t>Mo</w:t>
+            </w:r>
+            <w:r>
+              <w:rPr>
+                <w:rFonts w:ascii="Arial" w:eastAsia="Arial" w:hAnsi="Arial" w:cs="Arial"/>
+                <w:color w:val="58524E"/>
+                <w:sz w:val="20"/>
+                <w:szCs w:val="20"/>
+              </w:rPr>
+              <w:t xml:space="preserve">delli </w:t>
+            </w:r>
+            <w:r>
+              <w:rPr>
+                <w:rFonts w:ascii="Arial" w:eastAsia="Arial" w:hAnsi="Arial" w:cs="Arial"/>
+                <w:color w:val="58524E"/>
+                <w:sz w:val="20"/>
+                <w:szCs w:val="20"/>
+              </w:rPr>
+              <w:t>A</w:t>
+            </w:r>
+            <w:r>
+              <w:rPr>
+                <w:rFonts w:ascii="Arial" w:eastAsia="Arial" w:hAnsi="Arial" w:cs="Arial"/>
+                <w:color w:val="58524E"/>
+                <w:sz w:val="20"/>
+                <w:szCs w:val="20"/>
+              </w:rPr>
+              <w:t>I</w:t>
+            </w:r>
+            <w:r>
+              <w:rPr>
+                <w:rFonts w:ascii="Arial" w:eastAsia="Arial" w:hAnsi="Arial" w:cs="Arial"/>
+                <w:color w:val="58524E"/>
+                <w:sz w:val="20"/>
+                <w:szCs w:val="20"/>
+              </w:rPr>
+              <w:t xml:space="preserve">, </w:t>
+            </w:r>
+            <w:proofErr w:type="spellStart"/>
+            <w:r>
+              <w:rPr>
+                <w:rFonts w:ascii="Arial" w:eastAsia="Arial" w:hAnsi="Arial" w:cs="Arial"/>
+                <w:color w:val="58524E"/>
+                <w:sz w:val="20"/>
+                <w:szCs w:val="20"/>
+              </w:rPr>
+              <w:t>Foundry</w:t>
+            </w:r>
+            <w:proofErr w:type="spellEnd"/>
+            <w:r>
+              <w:rPr>
+                <w:rFonts w:ascii="Arial" w:eastAsia="Arial" w:hAnsi="Arial" w:cs="Arial"/>
+                <w:color w:val="58524E"/>
+                <w:sz w:val="20"/>
+                <w:szCs w:val="20"/>
+              </w:rPr>
+              <w:t xml:space="preserve"> Tools, AI Search), Innovazione Applicativa (App Service, Container Apps, AKS, </w:t>
+            </w:r>
+            <w:proofErr w:type="spellStart"/>
+            <w:r>
+              <w:rPr>
+                <w:rFonts w:ascii="Arial" w:eastAsia="Arial" w:hAnsi="Arial" w:cs="Arial"/>
+                <w:color w:val="58524E"/>
+                <w:sz w:val="20"/>
+                <w:szCs w:val="20"/>
+              </w:rPr>
+              <w:t>Functions</w:t>
+            </w:r>
+            <w:proofErr w:type="spellEnd"/>
+            <w:r>
+              <w:rPr>
+                <w:rFonts w:ascii="Arial" w:eastAsia="Arial" w:hAnsi="Arial" w:cs="Arial"/>
+                <w:color w:val="58524E"/>
+                <w:sz w:val="20"/>
+                <w:szCs w:val="20"/>
+              </w:rPr>
+              <w:t xml:space="preserve">), DevOps &amp; SDLC (Azure DevOps, GitHub, GitHub </w:t>
+            </w:r>
+            <w:proofErr w:type="spellStart"/>
+            <w:r>
+              <w:rPr>
+                <w:rFonts w:ascii="Arial" w:eastAsia="Arial" w:hAnsi="Arial" w:cs="Arial"/>
+                <w:color w:val="58524E"/>
+                <w:sz w:val="20"/>
+                <w:szCs w:val="20"/>
+              </w:rPr>
+              <w:t>Copilot</w:t>
+            </w:r>
+            <w:proofErr w:type="spellEnd"/>
+            <w:r>
+              <w:rPr>
+                <w:rFonts w:ascii="Arial" w:eastAsia="Arial" w:hAnsi="Arial" w:cs="Arial"/>
+                <w:color w:val="58524E"/>
+                <w:sz w:val="20"/>
+                <w:szCs w:val="20"/>
+              </w:rPr>
+              <w:t>, GitHub Actions), Cloud Architecture (Microservizi, Event-</w:t>
+            </w:r>
+            <w:proofErr w:type="spellStart"/>
+            <w:r>
+              <w:rPr>
+                <w:rFonts w:ascii="Arial" w:eastAsia="Arial" w:hAnsi="Arial" w:cs="Arial"/>
+                <w:color w:val="58524E"/>
+                <w:sz w:val="20"/>
+                <w:szCs w:val="20"/>
+              </w:rPr>
+              <w:t>Driven</w:t>
+            </w:r>
+            <w:proofErr w:type="spellEnd"/>
+            <w:r>
+              <w:rPr>
+                <w:rFonts w:ascii="Arial" w:eastAsia="Arial" w:hAnsi="Arial" w:cs="Arial"/>
+                <w:color w:val="58524E"/>
+                <w:sz w:val="20"/>
+                <w:szCs w:val="20"/>
+              </w:rPr>
+              <w:t xml:space="preserve">, </w:t>
+            </w:r>
+            <w:proofErr w:type="spellStart"/>
+            <w:r>
+              <w:rPr>
+                <w:rFonts w:ascii="Arial" w:eastAsia="Arial" w:hAnsi="Arial" w:cs="Arial"/>
+                <w:color w:val="58524E"/>
+                <w:sz w:val="20"/>
+                <w:szCs w:val="20"/>
+              </w:rPr>
+              <w:t>Serverless</w:t>
+            </w:r>
+            <w:proofErr w:type="spellEnd"/>
+            <w:r>
+              <w:rPr>
+                <w:rFonts w:ascii="Arial" w:eastAsia="Arial" w:hAnsi="Arial" w:cs="Arial"/>
+                <w:color w:val="58524E"/>
+                <w:sz w:val="20"/>
+                <w:szCs w:val="20"/>
+              </w:rPr>
+              <w:t>), Sviluppo Moderno (.NET, Visual Studio, VS Code)</w:t>
             </w:r>
           </w:p>
         </w:tc>
@@ -10528,7 +10543,27 @@
                 <w:sz w:val="20"/>
                 <w:szCs w:val="20"/>
               </w:rPr>
-              <w:t>Sono responsabile nell'aiutare i nostri clienti ad ottenere il meglio dalle loro scelte tecnologiche e dai team di sviluppo. Il mio obiettivo è semplice, stimolare ed ispirare i clienti Microsoft.</w:t>
+              <w:t xml:space="preserve">Sono responsabile nell'aiutare i nostri clienti ad ottenere il meglio dalle loro scelte tecnologiche e </w:t>
+            </w:r>
+            <w:proofErr w:type="gramStart"/>
+            <w:r>
+              <w:rPr>
+                <w:rFonts w:ascii="Arial" w:eastAsia="Arial" w:hAnsi="Arial" w:cs="Arial"/>
+                <w:color w:val="58524E"/>
+                <w:sz w:val="20"/>
+                <w:szCs w:val="20"/>
+              </w:rPr>
+              <w:t>dai team</w:t>
+            </w:r>
+            <w:proofErr w:type="gramEnd"/>
+            <w:r>
+              <w:rPr>
+                <w:rFonts w:ascii="Arial" w:eastAsia="Arial" w:hAnsi="Arial" w:cs="Arial"/>
+                <w:color w:val="58524E"/>
+                <w:sz w:val="20"/>
+                <w:szCs w:val="20"/>
+              </w:rPr>
+              <w:t xml:space="preserve"> di sviluppo. Il mio obiettivo è semplice, stimolare ed ispirare i clienti Microsoft.</w:t>
             </w:r>
           </w:p>
         </w:tc>
@@ -10670,7 +10705,25 @@
                 <w:color w:val="58524E"/>
                 <w:lang w:eastAsia="en-US"/>
               </w:rPr>
-              <w:t xml:space="preserve"> i team di sviluppo che implementan</w:t>
+              <w:t xml:space="preserve"> </w:t>
+            </w:r>
+            <w:proofErr w:type="gramStart"/>
+            <w:r>
+              <w:rPr>
+                <w:rFonts w:ascii="Arial" w:eastAsia="Arial" w:hAnsi="Arial" w:cs="Arial"/>
+                <w:color w:val="58524E"/>
+                <w:lang w:eastAsia="en-US"/>
+              </w:rPr>
+              <w:t>i team</w:t>
+            </w:r>
+            <w:proofErr w:type="gramEnd"/>
+            <w:r>
+              <w:rPr>
+                <w:rFonts w:ascii="Arial" w:eastAsia="Arial" w:hAnsi="Arial" w:cs="Arial"/>
+                <w:color w:val="58524E"/>
+                <w:lang w:eastAsia="en-US"/>
+              </w:rPr>
+              <w:t xml:space="preserve"> di sviluppo che implementan</w:t>
             </w:r>
             <w:r>
               <w:rPr>
@@ -11143,14 +11196,160 @@
               </w:rPr>
               <w:t xml:space="preserve">: </w:t>
             </w:r>
-            <w:r>
-              <w:rPr>
-                <w:rFonts w:ascii="Arial" w:eastAsia="Arial" w:hAnsi="Arial" w:cs="Arial"/>
-                <w:color w:val="58524E"/>
-                <w:lang w:eastAsia="en-US"/>
-              </w:rPr>
-              <w:t>NodeJS, Javascript, HTML, Angular, Electron, rsyslog, RabbitMQ, ElasticSearch, Logstash, Kibana, Beats, hawkBit, SailsJS</w:t>
-            </w:r>
+            <w:proofErr w:type="spellStart"/>
+            <w:r>
+              <w:rPr>
+                <w:rFonts w:ascii="Arial" w:eastAsia="Arial" w:hAnsi="Arial" w:cs="Arial"/>
+                <w:color w:val="58524E"/>
+                <w:lang w:eastAsia="en-US"/>
+              </w:rPr>
+              <w:t>NodeJS</w:t>
+            </w:r>
+            <w:proofErr w:type="spellEnd"/>
+            <w:r>
+              <w:rPr>
+                <w:rFonts w:ascii="Arial" w:eastAsia="Arial" w:hAnsi="Arial" w:cs="Arial"/>
+                <w:color w:val="58524E"/>
+                <w:lang w:eastAsia="en-US"/>
+              </w:rPr>
+              <w:t xml:space="preserve">, </w:t>
+            </w:r>
+            <w:proofErr w:type="spellStart"/>
+            <w:r>
+              <w:rPr>
+                <w:rFonts w:ascii="Arial" w:eastAsia="Arial" w:hAnsi="Arial" w:cs="Arial"/>
+                <w:color w:val="58524E"/>
+                <w:lang w:eastAsia="en-US"/>
+              </w:rPr>
+              <w:t>Javascript</w:t>
+            </w:r>
+            <w:proofErr w:type="spellEnd"/>
+            <w:r>
+              <w:rPr>
+                <w:rFonts w:ascii="Arial" w:eastAsia="Arial" w:hAnsi="Arial" w:cs="Arial"/>
+                <w:color w:val="58524E"/>
+                <w:lang w:eastAsia="en-US"/>
+              </w:rPr>
+              <w:t xml:space="preserve">, HTML, </w:t>
+            </w:r>
+            <w:proofErr w:type="spellStart"/>
+            <w:r>
+              <w:rPr>
+                <w:rFonts w:ascii="Arial" w:eastAsia="Arial" w:hAnsi="Arial" w:cs="Arial"/>
+                <w:color w:val="58524E"/>
+                <w:lang w:eastAsia="en-US"/>
+              </w:rPr>
+              <w:t>Angular</w:t>
+            </w:r>
+            <w:proofErr w:type="spellEnd"/>
+            <w:r>
+              <w:rPr>
+                <w:rFonts w:ascii="Arial" w:eastAsia="Arial" w:hAnsi="Arial" w:cs="Arial"/>
+                <w:color w:val="58524E"/>
+                <w:lang w:eastAsia="en-US"/>
+              </w:rPr>
+              <w:t xml:space="preserve">, Electron, </w:t>
+            </w:r>
+            <w:proofErr w:type="spellStart"/>
+            <w:r>
+              <w:rPr>
+                <w:rFonts w:ascii="Arial" w:eastAsia="Arial" w:hAnsi="Arial" w:cs="Arial"/>
+                <w:color w:val="58524E"/>
+                <w:lang w:eastAsia="en-US"/>
+              </w:rPr>
+              <w:t>rsyslog</w:t>
+            </w:r>
+            <w:proofErr w:type="spellEnd"/>
+            <w:r>
+              <w:rPr>
+                <w:rFonts w:ascii="Arial" w:eastAsia="Arial" w:hAnsi="Arial" w:cs="Arial"/>
+                <w:color w:val="58524E"/>
+                <w:lang w:eastAsia="en-US"/>
+              </w:rPr>
+              <w:t xml:space="preserve">, </w:t>
+            </w:r>
+            <w:proofErr w:type="spellStart"/>
+            <w:r>
+              <w:rPr>
+                <w:rFonts w:ascii="Arial" w:eastAsia="Arial" w:hAnsi="Arial" w:cs="Arial"/>
+                <w:color w:val="58524E"/>
+                <w:lang w:eastAsia="en-US"/>
+              </w:rPr>
+              <w:t>RabbitMQ</w:t>
+            </w:r>
+            <w:proofErr w:type="spellEnd"/>
+            <w:r>
+              <w:rPr>
+                <w:rFonts w:ascii="Arial" w:eastAsia="Arial" w:hAnsi="Arial" w:cs="Arial"/>
+                <w:color w:val="58524E"/>
+                <w:lang w:eastAsia="en-US"/>
+              </w:rPr>
+              <w:t xml:space="preserve">, </w:t>
+            </w:r>
+            <w:proofErr w:type="spellStart"/>
+            <w:r>
+              <w:rPr>
+                <w:rFonts w:ascii="Arial" w:eastAsia="Arial" w:hAnsi="Arial" w:cs="Arial"/>
+                <w:color w:val="58524E"/>
+                <w:lang w:eastAsia="en-US"/>
+              </w:rPr>
+              <w:t>ElasticSearch</w:t>
+            </w:r>
+            <w:proofErr w:type="spellEnd"/>
+            <w:r>
+              <w:rPr>
+                <w:rFonts w:ascii="Arial" w:eastAsia="Arial" w:hAnsi="Arial" w:cs="Arial"/>
+                <w:color w:val="58524E"/>
+                <w:lang w:eastAsia="en-US"/>
+              </w:rPr>
+              <w:t xml:space="preserve">, Logstash, </w:t>
+            </w:r>
+            <w:proofErr w:type="spellStart"/>
+            <w:r>
+              <w:rPr>
+                <w:rFonts w:ascii="Arial" w:eastAsia="Arial" w:hAnsi="Arial" w:cs="Arial"/>
+                <w:color w:val="58524E"/>
+                <w:lang w:eastAsia="en-US"/>
+              </w:rPr>
+              <w:t>Kibana</w:t>
+            </w:r>
+            <w:proofErr w:type="spellEnd"/>
+            <w:r>
+              <w:rPr>
+                <w:rFonts w:ascii="Arial" w:eastAsia="Arial" w:hAnsi="Arial" w:cs="Arial"/>
+                <w:color w:val="58524E"/>
+                <w:lang w:eastAsia="en-US"/>
+              </w:rPr>
+              <w:t xml:space="preserve">, Beats, </w:t>
+            </w:r>
+            <w:proofErr w:type="spellStart"/>
+            <w:r>
+              <w:rPr>
+                <w:rFonts w:ascii="Arial" w:eastAsia="Arial" w:hAnsi="Arial" w:cs="Arial"/>
+                <w:color w:val="58524E"/>
+                <w:lang w:eastAsia="en-US"/>
+              </w:rPr>
+              <w:t>hawkBit</w:t>
+            </w:r>
+            <w:proofErr w:type="spellEnd"/>
+            <w:r>
+              <w:rPr>
+                <w:rFonts w:ascii="Arial" w:eastAsia="Arial" w:hAnsi="Arial" w:cs="Arial"/>
+                <w:color w:val="58524E"/>
+                <w:lang w:eastAsia="en-US"/>
+              </w:rPr>
+              <w:t xml:space="preserve">, </w:t>
+            </w:r>
+            <w:proofErr w:type="spellStart"/>
+            <w:r>
+              <w:rPr>
+                <w:rFonts w:ascii="Arial" w:eastAsia="Arial" w:hAnsi="Arial" w:cs="Arial"/>
+                <w:color w:val="58524E"/>
+                <w:lang w:eastAsia="en-US"/>
+              </w:rPr>
+              <w:t>SailsJS</w:t>
+            </w:r>
+            <w:proofErr w:type="spellEnd"/>
           </w:p>
           <w:p>
             <w:pPr>
@@ -11235,6 +11434,7 @@
                 <w:lang w:val="en-US" w:eastAsia="en-US"/>
               </w:rPr>
             </w:pPr>
+            <w:proofErr w:type="spellStart"/>
             <w:r>
               <w:rPr>
                 <w:rFonts w:ascii="Arial" w:eastAsia="Arial" w:hAnsi="Arial" w:cs="Arial"/>
@@ -11242,15 +11442,43 @@
                 <w:color w:val="58524E"/>
                 <w:lang w:val="en-US" w:eastAsia="en-US"/>
               </w:rPr>
-              <w:t xml:space="preserve">Tecnologie: </w:t>
-            </w:r>
-            <w:r>
-              <w:rPr>
-                <w:rFonts w:ascii="Arial" w:eastAsia="Arial" w:hAnsi="Arial" w:cs="Arial"/>
+              <w:t>Tecnologie</w:t>
+            </w:r>
+            <w:proofErr w:type="spellEnd"/>
+            <w:r>
+              <w:rPr>
+                <w:rFonts w:ascii="Arial" w:eastAsia="Arial" w:hAnsi="Arial" w:cs="Arial"/>
+                <w:b/>
                 <w:color w:val="58524E"/>
                 <w:lang w:val="en-US" w:eastAsia="en-US"/>
               </w:rPr>
-              <w:t xml:space="preserve">C#, Javascript, </w:t>
+              <w:t xml:space="preserve">: </w:t>
+            </w:r>
+            <w:r>
+              <w:rPr>
+                <w:rFonts w:ascii="Arial" w:eastAsia="Arial" w:hAnsi="Arial" w:cs="Arial"/>
+                <w:color w:val="58524E"/>
+                <w:lang w:val="en-US" w:eastAsia="en-US"/>
+              </w:rPr>
+              <w:t xml:space="preserve">C#, </w:t>
+            </w:r>
+            <w:proofErr w:type="spellStart"/>
+            <w:r>
+              <w:rPr>
+                <w:rFonts w:ascii="Arial" w:eastAsia="Arial" w:hAnsi="Arial" w:cs="Arial"/>
+                <w:color w:val="58524E"/>
+                <w:lang w:val="en-US" w:eastAsia="en-US"/>
+              </w:rPr>
+              <w:t>Javascript</w:t>
+            </w:r>
+            <w:proofErr w:type="spellEnd"/>
+            <w:r>
+              <w:rPr>
+                <w:rFonts w:ascii="Arial" w:eastAsia="Arial" w:hAnsi="Arial" w:cs="Arial"/>
+                <w:color w:val="58524E"/>
+                <w:lang w:val="en-US" w:eastAsia="en-US"/>
+              </w:rPr>
+              <w:t xml:space="preserve">, </w:t>
             </w:r>
             <w:r>
               <w:rPr>
@@ -11729,7 +11957,16 @@
                 <w:color w:val="58524E"/>
                 <w:lang w:eastAsia="en-US"/>
               </w:rPr>
-              <w:t>ervizio per lo scambio digitale del DDT e dei documenti di ritorno che permette agli attori del processo logistico di accedere ad una piattaforma condivisa di document</w:t>
+              <w:t xml:space="preserve">ervizio per lo scambio digitale del DDT e dei documenti di ritorno che permette agli attori del processo logistico di accedere ad </w:t>
+            </w:r>
+            <w:r>
+              <w:rPr>
+                <w:rFonts w:ascii="Arial" w:eastAsia="Arial" w:hAnsi="Arial" w:cs="Arial"/>
+                <w:color w:val="58524E"/>
+                <w:lang w:eastAsia="en-US"/>
+              </w:rPr>
+              <w:lastRenderedPageBreak/>
+              <w:t>una piattaforma condivisa di document</w:t>
             </w:r>
             <w:r>
               <w:rPr>
@@ -11762,24 +11999,62 @@
                 <w:color w:val="58524E"/>
                 <w:lang w:eastAsia="en-US"/>
               </w:rPr>
-              <w:t xml:space="preserve">C#, SQL Server, EntityFramework, </w:t>
-            </w:r>
-            <w:r>
-              <w:rPr>
-                <w:rFonts w:ascii="Arial" w:eastAsia="Arial" w:hAnsi="Arial" w:cs="Arial"/>
-                <w:color w:val="58524E"/>
-                <w:lang w:eastAsia="en-US"/>
-              </w:rPr>
-              <w:t>WebServices SOAP</w:t>
-            </w:r>
-            <w:r>
-              <w:rPr>
-                <w:rFonts w:ascii="Arial" w:eastAsia="Arial" w:hAnsi="Arial" w:cs="Arial"/>
-                <w:color w:val="58524E"/>
-                <w:lang w:eastAsia="en-US"/>
-              </w:rPr>
-              <w:t>, Angular</w:t>
-            </w:r>
+              <w:t xml:space="preserve">C#, SQL Server, </w:t>
+            </w:r>
+            <w:proofErr w:type="spellStart"/>
+            <w:r>
+              <w:rPr>
+                <w:rFonts w:ascii="Arial" w:eastAsia="Arial" w:hAnsi="Arial" w:cs="Arial"/>
+                <w:color w:val="58524E"/>
+                <w:lang w:eastAsia="en-US"/>
+              </w:rPr>
+              <w:t>EntityFramework</w:t>
+            </w:r>
+            <w:proofErr w:type="spellEnd"/>
+            <w:r>
+              <w:rPr>
+                <w:rFonts w:ascii="Arial" w:eastAsia="Arial" w:hAnsi="Arial" w:cs="Arial"/>
+                <w:color w:val="58524E"/>
+                <w:lang w:eastAsia="en-US"/>
+              </w:rPr>
+              <w:t xml:space="preserve">, </w:t>
+            </w:r>
+            <w:proofErr w:type="spellStart"/>
+            <w:r>
+              <w:rPr>
+                <w:rFonts w:ascii="Arial" w:eastAsia="Arial" w:hAnsi="Arial" w:cs="Arial"/>
+                <w:color w:val="58524E"/>
+                <w:lang w:eastAsia="en-US"/>
+              </w:rPr>
+              <w:t>WebServices</w:t>
+            </w:r>
+            <w:proofErr w:type="spellEnd"/>
+            <w:r>
+              <w:rPr>
+                <w:rFonts w:ascii="Arial" w:eastAsia="Arial" w:hAnsi="Arial" w:cs="Arial"/>
+                <w:color w:val="58524E"/>
+                <w:lang w:eastAsia="en-US"/>
+              </w:rPr>
+              <w:t xml:space="preserve"> SOAP</w:t>
+            </w:r>
+            <w:r>
+              <w:rPr>
+                <w:rFonts w:ascii="Arial" w:eastAsia="Arial" w:hAnsi="Arial" w:cs="Arial"/>
+                <w:color w:val="58524E"/>
+                <w:lang w:eastAsia="en-US"/>
+              </w:rPr>
+              <w:t xml:space="preserve">, </w:t>
+            </w:r>
+            <w:proofErr w:type="spellStart"/>
+            <w:r>
+              <w:rPr>
+                <w:rFonts w:ascii="Arial" w:eastAsia="Arial" w:hAnsi="Arial" w:cs="Arial"/>
+                <w:color w:val="58524E"/>
+                <w:lang w:eastAsia="en-US"/>
+              </w:rPr>
+              <w:t>Angular</w:t>
+            </w:r>
+            <w:proofErr w:type="spellEnd"/>
           </w:p>
           <w:p>
             <w:pPr>
@@ -11856,6 +12131,7 @@
                 <w:lang w:val="en-US" w:eastAsia="en-US"/>
               </w:rPr>
             </w:pPr>
+            <w:proofErr w:type="spellStart"/>
             <w:r>
               <w:rPr>
                 <w:rFonts w:ascii="Arial" w:eastAsia="Arial" w:hAnsi="Arial" w:cs="Arial"/>
@@ -11863,16 +12139,43 @@
                 <w:color w:val="58524E"/>
                 <w:lang w:val="en-US" w:eastAsia="en-US"/>
               </w:rPr>
-              <w:lastRenderedPageBreak/>
-              <w:t xml:space="preserve">Tecnologie: </w:t>
-            </w:r>
-            <w:r>
-              <w:rPr>
-                <w:rFonts w:ascii="Arial" w:eastAsia="Arial" w:hAnsi="Arial" w:cs="Arial"/>
+              <w:t>Tecnologie</w:t>
+            </w:r>
+            <w:proofErr w:type="spellEnd"/>
+            <w:r>
+              <w:rPr>
+                <w:rFonts w:ascii="Arial" w:eastAsia="Arial" w:hAnsi="Arial" w:cs="Arial"/>
+                <w:b/>
                 <w:color w:val="58524E"/>
                 <w:lang w:val="en-US" w:eastAsia="en-US"/>
               </w:rPr>
-              <w:t>C#, SQL Server, EntityFramework, ASP.NET Web API, Swagger, Angular</w:t>
+              <w:t xml:space="preserve">: </w:t>
+            </w:r>
+            <w:r>
+              <w:rPr>
+                <w:rFonts w:ascii="Arial" w:eastAsia="Arial" w:hAnsi="Arial" w:cs="Arial"/>
+                <w:color w:val="58524E"/>
+                <w:lang w:val="en-US" w:eastAsia="en-US"/>
+              </w:rPr>
+              <w:t xml:space="preserve">C#, SQL Server, </w:t>
+            </w:r>
+            <w:proofErr w:type="spellStart"/>
+            <w:r>
+              <w:rPr>
+                <w:rFonts w:ascii="Arial" w:eastAsia="Arial" w:hAnsi="Arial" w:cs="Arial"/>
+                <w:color w:val="58524E"/>
+                <w:lang w:val="en-US" w:eastAsia="en-US"/>
+              </w:rPr>
+              <w:t>EntityFramework</w:t>
+            </w:r>
+            <w:proofErr w:type="spellEnd"/>
+            <w:r>
+              <w:rPr>
+                <w:rFonts w:ascii="Arial" w:eastAsia="Arial" w:hAnsi="Arial" w:cs="Arial"/>
+                <w:color w:val="58524E"/>
+                <w:lang w:val="en-US" w:eastAsia="en-US"/>
+              </w:rPr>
+              <w:t>, ASP.NET Web API, Swagger, Angular</w:t>
             </w:r>
           </w:p>
         </w:tc>
@@ -11905,7 +12208,6 @@
                 <w:sz w:val="20"/>
                 <w:szCs w:val="20"/>
               </w:rPr>
-              <w:lastRenderedPageBreak/>
               <w:t>Periodo</w:t>
             </w:r>
           </w:p>
@@ -12227,6 +12529,7 @@
               </w:rPr>
               <w:br/>
             </w:r>
+            <w:proofErr w:type="spellStart"/>
             <w:r>
               <w:rPr>
                 <w:rFonts w:ascii="Arial" w:eastAsia="Arial" w:hAnsi="Arial" w:cs="Arial"/>
@@ -12234,15 +12537,61 @@
                 <w:color w:val="58524E"/>
                 <w:lang w:val="en-US" w:eastAsia="en-US"/>
               </w:rPr>
-              <w:t xml:space="preserve">Tecnologie: </w:t>
-            </w:r>
-            <w:r>
-              <w:rPr>
-                <w:rFonts w:ascii="Arial" w:eastAsia="Arial" w:hAnsi="Arial" w:cs="Arial"/>
+              <w:t>Tecnologie</w:t>
+            </w:r>
+            <w:proofErr w:type="spellEnd"/>
+            <w:r>
+              <w:rPr>
+                <w:rFonts w:ascii="Arial" w:eastAsia="Arial" w:hAnsi="Arial" w:cs="Arial"/>
+                <w:b/>
                 <w:color w:val="58524E"/>
                 <w:lang w:val="en-US" w:eastAsia="en-US"/>
               </w:rPr>
-              <w:t>ASP.NET Web Form, C#, EntityFramework, HTML, CSS, jQuery, SQL Server, WebServices SOAP</w:t>
+              <w:t xml:space="preserve">: </w:t>
+            </w:r>
+            <w:r>
+              <w:rPr>
+                <w:rFonts w:ascii="Arial" w:eastAsia="Arial" w:hAnsi="Arial" w:cs="Arial"/>
+                <w:color w:val="58524E"/>
+                <w:lang w:val="en-US" w:eastAsia="en-US"/>
+              </w:rPr>
+              <w:t xml:space="preserve">ASP.NET Web Form, C#, </w:t>
+            </w:r>
+            <w:proofErr w:type="spellStart"/>
+            <w:r>
+              <w:rPr>
+                <w:rFonts w:ascii="Arial" w:eastAsia="Arial" w:hAnsi="Arial" w:cs="Arial"/>
+                <w:color w:val="58524E"/>
+                <w:lang w:val="en-US" w:eastAsia="en-US"/>
+              </w:rPr>
+              <w:t>EntityFramework</w:t>
+            </w:r>
+            <w:proofErr w:type="spellEnd"/>
+            <w:r>
+              <w:rPr>
+                <w:rFonts w:ascii="Arial" w:eastAsia="Arial" w:hAnsi="Arial" w:cs="Arial"/>
+                <w:color w:val="58524E"/>
+                <w:lang w:val="en-US" w:eastAsia="en-US"/>
+              </w:rPr>
+              <w:t xml:space="preserve">, HTML, CSS, jQuery, SQL Server, </w:t>
+            </w:r>
+            <w:proofErr w:type="spellStart"/>
+            <w:r>
+              <w:rPr>
+                <w:rFonts w:ascii="Arial" w:eastAsia="Arial" w:hAnsi="Arial" w:cs="Arial"/>
+                <w:color w:val="58524E"/>
+                <w:lang w:val="en-US" w:eastAsia="en-US"/>
+              </w:rPr>
+              <w:t>WebServices</w:t>
+            </w:r>
+            <w:proofErr w:type="spellEnd"/>
+            <w:r>
+              <w:rPr>
+                <w:rFonts w:ascii="Arial" w:eastAsia="Arial" w:hAnsi="Arial" w:cs="Arial"/>
+                <w:color w:val="58524E"/>
+                <w:lang w:val="en-US" w:eastAsia="en-US"/>
+              </w:rPr>
+              <w:t xml:space="preserve"> SOAP</w:t>
             </w:r>
           </w:p>
           <w:p>
@@ -12478,6 +12827,7 @@
               </w:rPr>
               <w:br/>
             </w:r>
+            <w:proofErr w:type="spellStart"/>
             <w:r>
               <w:rPr>
                 <w:rFonts w:ascii="Arial" w:eastAsia="Arial" w:hAnsi="Arial" w:cs="Arial"/>
@@ -12485,15 +12835,43 @@
                 <w:color w:val="58524E"/>
                 <w:lang w:val="en-US" w:eastAsia="en-US"/>
               </w:rPr>
-              <w:t xml:space="preserve">Tecnologie: </w:t>
-            </w:r>
-            <w:r>
-              <w:rPr>
-                <w:rFonts w:ascii="Arial" w:eastAsia="Arial" w:hAnsi="Arial" w:cs="Arial"/>
+              <w:t>Tecnologie</w:t>
+            </w:r>
+            <w:proofErr w:type="spellEnd"/>
+            <w:r>
+              <w:rPr>
+                <w:rFonts w:ascii="Arial" w:eastAsia="Arial" w:hAnsi="Arial" w:cs="Arial"/>
+                <w:b/>
                 <w:color w:val="58524E"/>
                 <w:lang w:val="en-US" w:eastAsia="en-US"/>
               </w:rPr>
-              <w:t>Windows Form, Visual Basic.NET, SQL Server, Access, Crystal Report, WebServices REST, Dapper</w:t>
+              <w:t xml:space="preserve">: </w:t>
+            </w:r>
+            <w:r>
+              <w:rPr>
+                <w:rFonts w:ascii="Arial" w:eastAsia="Arial" w:hAnsi="Arial" w:cs="Arial"/>
+                <w:color w:val="58524E"/>
+                <w:lang w:val="en-US" w:eastAsia="en-US"/>
+              </w:rPr>
+              <w:t xml:space="preserve">Windows Form, Visual Basic.NET, SQL Server, Access, Crystal Report, </w:t>
+            </w:r>
+            <w:proofErr w:type="spellStart"/>
+            <w:r>
+              <w:rPr>
+                <w:rFonts w:ascii="Arial" w:eastAsia="Arial" w:hAnsi="Arial" w:cs="Arial"/>
+                <w:color w:val="58524E"/>
+                <w:lang w:val="en-US" w:eastAsia="en-US"/>
+              </w:rPr>
+              <w:t>WebServices</w:t>
+            </w:r>
+            <w:proofErr w:type="spellEnd"/>
+            <w:r>
+              <w:rPr>
+                <w:rFonts w:ascii="Arial" w:eastAsia="Arial" w:hAnsi="Arial" w:cs="Arial"/>
+                <w:color w:val="58524E"/>
+                <w:lang w:val="en-US" w:eastAsia="en-US"/>
+              </w:rPr>
+              <w:t xml:space="preserve"> REST, Dapper</w:t>
             </w:r>
           </w:p>
           <w:p>
@@ -12583,6 +12961,7 @@
                 <w:lang w:val="en-US" w:eastAsia="en-US"/>
               </w:rPr>
             </w:pPr>
+            <w:proofErr w:type="spellStart"/>
             <w:r>
               <w:rPr>
                 <w:rFonts w:ascii="Arial" w:eastAsia="Arial" w:hAnsi="Arial" w:cs="Arial"/>
@@ -12590,7 +12969,17 @@
                 <w:color w:val="58524E"/>
                 <w:lang w:val="en-US" w:eastAsia="en-US"/>
               </w:rPr>
-              <w:t xml:space="preserve">Tecnologie: </w:t>
+              <w:t>Tecnologie</w:t>
+            </w:r>
+            <w:proofErr w:type="spellEnd"/>
+            <w:r>
+              <w:rPr>
+                <w:rFonts w:ascii="Arial" w:eastAsia="Arial" w:hAnsi="Arial" w:cs="Arial"/>
+                <w:b/>
+                <w:color w:val="58524E"/>
+                <w:lang w:val="en-US" w:eastAsia="en-US"/>
+              </w:rPr>
+              <w:t xml:space="preserve">: </w:t>
             </w:r>
             <w:r>
               <w:rPr>
@@ -12607,7 +12996,43 @@
                 <w:color w:val="58524E"/>
                 <w:lang w:val="en-US" w:eastAsia="en-US"/>
               </w:rPr>
-              <w:t>/XAML, C#, EntityFramework, SQL Server, WebServices REST</w:t>
+              <w:t xml:space="preserve">/XAML, C#, </w:t>
+            </w:r>
+            <w:proofErr w:type="spellStart"/>
+            <w:r>
+              <w:rPr>
+                <w:rFonts w:ascii="Arial" w:eastAsia="Arial" w:hAnsi="Arial" w:cs="Arial"/>
+                <w:color w:val="58524E"/>
+                <w:lang w:val="en-US" w:eastAsia="en-US"/>
+              </w:rPr>
+              <w:t>EntityFramework</w:t>
+            </w:r>
+            <w:proofErr w:type="spellEnd"/>
+            <w:r>
+              <w:rPr>
+                <w:rFonts w:ascii="Arial" w:eastAsia="Arial" w:hAnsi="Arial" w:cs="Arial"/>
+                <w:color w:val="58524E"/>
+                <w:lang w:val="en-US" w:eastAsia="en-US"/>
+              </w:rPr>
+              <w:t xml:space="preserve">, SQL Server, </w:t>
+            </w:r>
+            <w:proofErr w:type="spellStart"/>
+            <w:r>
+              <w:rPr>
+                <w:rFonts w:ascii="Arial" w:eastAsia="Arial" w:hAnsi="Arial" w:cs="Arial"/>
+                <w:color w:val="58524E"/>
+                <w:lang w:val="en-US" w:eastAsia="en-US"/>
+              </w:rPr>
+              <w:t>WebServices</w:t>
+            </w:r>
+            <w:proofErr w:type="spellEnd"/>
+            <w:r>
+              <w:rPr>
+                <w:rFonts w:ascii="Arial" w:eastAsia="Arial" w:hAnsi="Arial" w:cs="Arial"/>
+                <w:color w:val="58524E"/>
+                <w:lang w:val="en-US" w:eastAsia="en-US"/>
+              </w:rPr>
+              <w:t xml:space="preserve"> REST</w:t>
             </w:r>
           </w:p>
         </w:tc>
@@ -12971,6 +13396,7 @@
                 <w:lang w:val="en-US" w:eastAsia="en-US"/>
               </w:rPr>
             </w:pPr>
+            <w:proofErr w:type="spellStart"/>
             <w:r>
               <w:rPr>
                 <w:rFonts w:ascii="Arial" w:eastAsia="Arial" w:hAnsi="Arial" w:cs="Arial"/>
@@ -12978,15 +13404,43 @@
                 <w:color w:val="58524E"/>
                 <w:lang w:val="en-US" w:eastAsia="en-US"/>
               </w:rPr>
-              <w:t xml:space="preserve">Tecnologie: </w:t>
-            </w:r>
-            <w:r>
-              <w:rPr>
-                <w:rFonts w:ascii="Arial" w:eastAsia="Arial" w:hAnsi="Arial" w:cs="Arial"/>
+              <w:t>Tecnologie</w:t>
+            </w:r>
+            <w:proofErr w:type="spellEnd"/>
+            <w:r>
+              <w:rPr>
+                <w:rFonts w:ascii="Arial" w:eastAsia="Arial" w:hAnsi="Arial" w:cs="Arial"/>
+                <w:b/>
                 <w:color w:val="58524E"/>
                 <w:lang w:val="en-US" w:eastAsia="en-US"/>
               </w:rPr>
-              <w:t>ASP.NET Web Form, C#, SQL Embedded, HTML, CSS, SQL Server, WebServices SOAP</w:t>
+              <w:t xml:space="preserve">: </w:t>
+            </w:r>
+            <w:r>
+              <w:rPr>
+                <w:rFonts w:ascii="Arial" w:eastAsia="Arial" w:hAnsi="Arial" w:cs="Arial"/>
+                <w:color w:val="58524E"/>
+                <w:lang w:val="en-US" w:eastAsia="en-US"/>
+              </w:rPr>
+              <w:t xml:space="preserve">ASP.NET Web Form, C#, SQL Embedded, HTML, CSS, SQL Server, </w:t>
+            </w:r>
+            <w:proofErr w:type="spellStart"/>
+            <w:r>
+              <w:rPr>
+                <w:rFonts w:ascii="Arial" w:eastAsia="Arial" w:hAnsi="Arial" w:cs="Arial"/>
+                <w:color w:val="58524E"/>
+                <w:lang w:val="en-US" w:eastAsia="en-US"/>
+              </w:rPr>
+              <w:t>WebServices</w:t>
+            </w:r>
+            <w:proofErr w:type="spellEnd"/>
+            <w:r>
+              <w:rPr>
+                <w:rFonts w:ascii="Arial" w:eastAsia="Arial" w:hAnsi="Arial" w:cs="Arial"/>
+                <w:color w:val="58524E"/>
+                <w:lang w:val="en-US" w:eastAsia="en-US"/>
+              </w:rPr>
+              <w:t xml:space="preserve"> SOAP</w:t>
             </w:r>
           </w:p>
           <w:p>
@@ -13107,7 +13561,52 @@
                 <w:color w:val="58524E"/>
                 <w:lang w:eastAsia="en-US"/>
               </w:rPr>
-              <w:t>Implementazione di un sistema PACS (Picture archiving and communication system) per l'archiviazione, trasmissione, visualizzazione e stampa delle immagini diagnostiche digitali in 3D e 4D tramite lo standard DICOM</w:t>
+              <w:t xml:space="preserve">Implementazione di un sistema PACS (Picture </w:t>
+            </w:r>
+            <w:proofErr w:type="spellStart"/>
+            <w:r>
+              <w:rPr>
+                <w:rFonts w:ascii="Arial" w:eastAsia="Arial" w:hAnsi="Arial" w:cs="Arial"/>
+                <w:color w:val="58524E"/>
+                <w:lang w:eastAsia="en-US"/>
+              </w:rPr>
+              <w:t>archiving</w:t>
+            </w:r>
+            <w:proofErr w:type="spellEnd"/>
+            <w:r>
+              <w:rPr>
+                <w:rFonts w:ascii="Arial" w:eastAsia="Arial" w:hAnsi="Arial" w:cs="Arial"/>
+                <w:color w:val="58524E"/>
+                <w:lang w:eastAsia="en-US"/>
+              </w:rPr>
+              <w:t xml:space="preserve"> and </w:t>
+            </w:r>
+            <w:proofErr w:type="spellStart"/>
+            <w:r>
+              <w:rPr>
+                <w:rFonts w:ascii="Arial" w:eastAsia="Arial" w:hAnsi="Arial" w:cs="Arial"/>
+                <w:color w:val="58524E"/>
+                <w:lang w:eastAsia="en-US"/>
+              </w:rPr>
+              <w:t>communication</w:t>
+            </w:r>
+            <w:proofErr w:type="spellEnd"/>
+            <w:r>
+              <w:rPr>
+                <w:rFonts w:ascii="Arial" w:eastAsia="Arial" w:hAnsi="Arial" w:cs="Arial"/>
+                <w:color w:val="58524E"/>
+                <w:lang w:eastAsia="en-US"/>
+              </w:rPr>
+              <w:t xml:space="preserve"> system) per l'archiviazione, trasmissione, visualizzazione e stampa delle immagini </w:t>
+            </w:r>
+            <w:r>
+              <w:rPr>
+                <w:rFonts w:ascii="Arial" w:eastAsia="Arial" w:hAnsi="Arial" w:cs="Arial"/>
+                <w:color w:val="58524E"/>
+                <w:lang w:eastAsia="en-US"/>
+              </w:rPr>
+              <w:lastRenderedPageBreak/>
+              <w:t>diagnostiche digitali in 3D e 4D tramite lo standard DICOM</w:t>
             </w:r>
             <w:r>
               <w:rPr>
@@ -13161,6 +13660,7 @@
                 <w:lang w:val="en-US" w:eastAsia="en-US"/>
               </w:rPr>
             </w:pPr>
+            <w:proofErr w:type="spellStart"/>
             <w:r>
               <w:rPr>
                 <w:rFonts w:ascii="Arial" w:eastAsia="Arial" w:hAnsi="Arial" w:cs="Arial"/>
@@ -13168,15 +13668,43 @@
                 <w:color w:val="58524E"/>
                 <w:lang w:val="en-US" w:eastAsia="en-US"/>
               </w:rPr>
-              <w:t xml:space="preserve">Tecnologie: </w:t>
-            </w:r>
-            <w:r>
-              <w:rPr>
-                <w:rFonts w:ascii="Arial" w:eastAsia="Arial" w:hAnsi="Arial" w:cs="Arial"/>
+              <w:t>Tecnologie</w:t>
+            </w:r>
+            <w:proofErr w:type="spellEnd"/>
+            <w:r>
+              <w:rPr>
+                <w:rFonts w:ascii="Arial" w:eastAsia="Arial" w:hAnsi="Arial" w:cs="Arial"/>
+                <w:b/>
                 <w:color w:val="58524E"/>
                 <w:lang w:val="en-US" w:eastAsia="en-US"/>
               </w:rPr>
-              <w:t>Windows Form, Visual Basic.NET, SQL Embedded, HTML, CSS, SQL Server, WebServices SOAP, Crystal Report</w:t>
+              <w:t xml:space="preserve">: </w:t>
+            </w:r>
+            <w:r>
+              <w:rPr>
+                <w:rFonts w:ascii="Arial" w:eastAsia="Arial" w:hAnsi="Arial" w:cs="Arial"/>
+                <w:color w:val="58524E"/>
+                <w:lang w:val="en-US" w:eastAsia="en-US"/>
+              </w:rPr>
+              <w:t xml:space="preserve">Windows Form, Visual Basic.NET, SQL Embedded, HTML, CSS, SQL Server, </w:t>
+            </w:r>
+            <w:proofErr w:type="spellStart"/>
+            <w:r>
+              <w:rPr>
+                <w:rFonts w:ascii="Arial" w:eastAsia="Arial" w:hAnsi="Arial" w:cs="Arial"/>
+                <w:color w:val="58524E"/>
+                <w:lang w:val="en-US" w:eastAsia="en-US"/>
+              </w:rPr>
+              <w:t>WebServices</w:t>
+            </w:r>
+            <w:proofErr w:type="spellEnd"/>
+            <w:r>
+              <w:rPr>
+                <w:rFonts w:ascii="Arial" w:eastAsia="Arial" w:hAnsi="Arial" w:cs="Arial"/>
+                <w:color w:val="58524E"/>
+                <w:lang w:val="en-US" w:eastAsia="en-US"/>
+              </w:rPr>
+              <w:t xml:space="preserve"> SOAP, Crystal Report</w:t>
             </w:r>
           </w:p>
           <w:p>
@@ -13231,7 +13759,6 @@
                 <w:color w:val="58524E"/>
                 <w:lang w:eastAsia="en-US"/>
               </w:rPr>
-              <w:lastRenderedPageBreak/>
               <w:t xml:space="preserve">Descrizione: </w:t>
             </w:r>
             <w:r>
@@ -13262,6 +13789,7 @@
                 <w:lang w:val="en-US"/>
               </w:rPr>
             </w:pPr>
+            <w:proofErr w:type="spellStart"/>
             <w:r>
               <w:rPr>
                 <w:rFonts w:ascii="Arial" w:eastAsia="Arial" w:hAnsi="Arial" w:cs="Arial"/>
@@ -13269,15 +13797,43 @@
                 <w:color w:val="58524E"/>
                 <w:lang w:val="en-US" w:eastAsia="en-US"/>
               </w:rPr>
-              <w:t xml:space="preserve">Tecnologie: </w:t>
-            </w:r>
-            <w:r>
-              <w:rPr>
-                <w:rFonts w:ascii="Arial" w:eastAsia="Arial" w:hAnsi="Arial" w:cs="Arial"/>
+              <w:t>Tecnologie</w:t>
+            </w:r>
+            <w:proofErr w:type="spellEnd"/>
+            <w:r>
+              <w:rPr>
+                <w:rFonts w:ascii="Arial" w:eastAsia="Arial" w:hAnsi="Arial" w:cs="Arial"/>
+                <w:b/>
                 <w:color w:val="58524E"/>
                 <w:lang w:val="en-US" w:eastAsia="en-US"/>
               </w:rPr>
-              <w:t xml:space="preserve">Windows Form, C#, SQL Embedded, Crystal Report, Sql Server, Windows Mobile, SQL Server CE </w:t>
+              <w:t xml:space="preserve">: </w:t>
+            </w:r>
+            <w:r>
+              <w:rPr>
+                <w:rFonts w:ascii="Arial" w:eastAsia="Arial" w:hAnsi="Arial" w:cs="Arial"/>
+                <w:color w:val="58524E"/>
+                <w:lang w:val="en-US" w:eastAsia="en-US"/>
+              </w:rPr>
+              <w:t xml:space="preserve">Windows Form, C#, SQL Embedded, Crystal Report, </w:t>
+            </w:r>
+            <w:proofErr w:type="spellStart"/>
+            <w:r>
+              <w:rPr>
+                <w:rFonts w:ascii="Arial" w:eastAsia="Arial" w:hAnsi="Arial" w:cs="Arial"/>
+                <w:color w:val="58524E"/>
+                <w:lang w:val="en-US" w:eastAsia="en-US"/>
+              </w:rPr>
+              <w:t>Sql</w:t>
+            </w:r>
+            <w:proofErr w:type="spellEnd"/>
+            <w:r>
+              <w:rPr>
+                <w:rFonts w:ascii="Arial" w:eastAsia="Arial" w:hAnsi="Arial" w:cs="Arial"/>
+                <w:color w:val="58524E"/>
+                <w:lang w:val="en-US" w:eastAsia="en-US"/>
+              </w:rPr>
+              <w:t xml:space="preserve"> Server, Windows Mobile, SQL Server CE </w:t>
             </w:r>
           </w:p>
           <w:p>
@@ -13328,7 +13884,6 @@
           <w:noProof/>
           <w:lang w:eastAsia="it-IT"/>
         </w:rPr>
-        <w:lastRenderedPageBreak/>
         <mc:AlternateContent>
           <mc:Choice Requires="wpg">
             <w:drawing>
@@ -15227,7 +15782,7 @@
                 <w:szCs w:val="20"/>
               </w:rPr>
             </w:pPr>
-            <w:hyperlink r:id="rId18" w:history="1">
+            <w:hyperlink r:id="rId16" w:history="1">
               <w:r>
                 <w:rPr>
                   <w:rStyle w:val="Hyperlink"/>
@@ -15529,6 +16084,7 @@
                 <w:lang w:eastAsia="en-US"/>
               </w:rPr>
             </w:pPr>
+            <w:proofErr w:type="spellStart"/>
             <w:r>
               <w:rPr>
                 <w:rFonts w:ascii="Arial" w:eastAsia="Arial" w:hAnsi="Arial" w:cs="Arial"/>
@@ -15548,6 +16104,7 @@
               </w:rPr>
               <w:t>avings</w:t>
             </w:r>
+            <w:proofErr w:type="spellEnd"/>
           </w:p>
         </w:tc>
       </w:tr>
@@ -15602,7 +16159,7 @@
                 <w:szCs w:val="20"/>
               </w:rPr>
             </w:pPr>
-            <w:hyperlink r:id="rId19" w:history="1">
+            <w:hyperlink r:id="rId17" w:history="1">
               <w:r>
                 <w:rPr>
                   <w:rStyle w:val="Hyperlink"/>
@@ -15884,6 +16441,7 @@
                 <w:lang w:eastAsia="en-US"/>
               </w:rPr>
             </w:pPr>
+            <w:proofErr w:type="spellStart"/>
             <w:r>
               <w:rPr>
                 <w:rFonts w:ascii="Arial" w:eastAsia="Arial" w:hAnsi="Arial" w:cs="Arial"/>
@@ -15892,7 +16450,18 @@
                 <w:sz w:val="24"/>
                 <w:lang w:eastAsia="en-US"/>
               </w:rPr>
-              <w:t>ChessBoard Plus</w:t>
+              <w:t>ChessBoard</w:t>
+            </w:r>
+            <w:proofErr w:type="spellEnd"/>
+            <w:r>
+              <w:rPr>
+                <w:rFonts w:ascii="Arial" w:eastAsia="Arial" w:hAnsi="Arial" w:cs="Arial"/>
+                <w:b/>
+                <w:color w:val="58524E"/>
+                <w:sz w:val="24"/>
+                <w:lang w:eastAsia="en-US"/>
+              </w:rPr>
+              <w:t xml:space="preserve"> Plus</w:t>
             </w:r>
           </w:p>
         </w:tc>
@@ -15948,7 +16517,7 @@
                 <w:szCs w:val="20"/>
               </w:rPr>
             </w:pPr>
-            <w:hyperlink r:id="rId20" w:history="1">
+            <w:hyperlink r:id="rId18" w:history="1">
               <w:r>
                 <w:rPr>
                   <w:rStyle w:val="Hyperlink"/>
@@ -16268,7 +16837,7 @@
                 <w:szCs w:val="20"/>
               </w:rPr>
             </w:pPr>
-            <w:hyperlink r:id="rId21" w:history="1">
+            <w:hyperlink r:id="rId19" w:history="1">
               <w:r>
                 <w:rPr>
                   <w:rStyle w:val="Hyperlink"/>
@@ -16483,7 +17052,7 @@
       </w:pPr>
     </w:p>
     <w:sectPr>
-      <w:footerReference w:type="default" r:id="rId22"/>
+      <w:footerReference w:type="default" r:id="rId20"/>
       <w:type w:val="continuous"/>
       <w:pgSz w:w="11920" w:h="16840"/>
       <w:pgMar w:top="900" w:right="1100" w:bottom="280" w:left="1020" w:header="0" w:footer="170" w:gutter="0"/>
@@ -16828,22 +17397,6 @@
               <w:sz w:val="16"/>
             </w:rPr>
             <w:t>Contatti</w:t>
-          </w:r>
-        </w:p>
-        <w:p>
-          <w:pPr>
-            <w:pStyle w:val="Footer"/>
-            <w:rPr>
-              <w:color w:val="595959" w:themeColor="text1" w:themeTint="A6"/>
-              <w:sz w:val="14"/>
-            </w:rPr>
-          </w:pPr>
-          <w:r>
-            <w:rPr>
-              <w:color w:val="595959" w:themeColor="text1" w:themeTint="A6"/>
-              <w:sz w:val="14"/>
-            </w:rPr>
-            <w:t>Tel: 3896403200</w:t>
           </w:r>
         </w:p>
         <w:p>

</xml_diff>